<commit_message>
docs(report): make three risk classes and practicality explicit
Abstract, keywords, 1.2, 1.4 (new table 2), new 1.6 practicality section,
risk-type column in the bench target table, 3.9, 4.1 and 5.1 now name
credential leakage, out-of-scope file reads and unauthorized network access
together. TOC becomes a Word TOC field with the verified static result.

Co-Authored-By: Claude Opus 5.5 <noreply@anthropic.com>
Claude-Session: https://claude.ai/code/session_01QLQFrwW1hV7hrYF9ugkKnx
</commit_message>
<xml_diff>
--- a/docs/report-v3/out/credproof-report.docx
+++ b/docs/report-v3/out/credproof-report.docx
@@ -486,6 +486,15 @@
         <w:ind w:firstLine="0" w:left="0"/>
       </w:pPr>
       <w:r>
+        <w:fldChar w:fldCharType="begin"/>
+      </w:r>
+      <w:r>
+        <w:instrText xml:space="preserve"> TOC \o "1-2" \h \z \u </w:instrText>
+      </w:r>
+      <w:r>
+        <w:fldChar w:fldCharType="separate"/>
+      </w:r>
+      <w:r>
         <w:rPr>
           <w:rFonts w:ascii="宋体" w:hAnsi="宋体" w:eastAsia="宋体" w:cs="宋体"/>
           <w:b/>
@@ -669,7 +678,35 @@
           <w:sz w:val="24"/>
         </w:rPr>
         <w:tab/>
-        <w:t>13</w:t>
+        <w:t>16</w:t>
+      </w:r>
+    </w:p>
+    <w:p>
+      <w:pPr>
+        <w:widowControl/>
+        <w:tabs>
+          <w:tab w:pos="8617" w:val="right" w:leader="dot"/>
+        </w:tabs>
+        <w:spacing w:line="360" w:lineRule="auto" w:before="0" w:after="0"/>
+        <w:ind w:firstLine="0" w:left="480"/>
+      </w:pPr>
+      <w:r>
+        <w:rPr>
+          <w:rFonts w:ascii="宋体" w:hAnsi="宋体" w:eastAsia="宋体" w:cs="宋体"/>
+          <w:b w:val="0"/>
+          <w:color w:val="000000"/>
+          <w:sz w:val="24"/>
+        </w:rPr>
+        <w:t>1.6 实用性：直接进入日常开发流程</w:t>
+      </w:r>
+      <w:r>
+        <w:rPr>
+          <w:rFonts w:ascii="宋体" w:hAnsi="宋体" w:eastAsia="宋体" w:cs="宋体"/>
+          <w:color w:val="000000"/>
+          <w:sz w:val="24"/>
+        </w:rPr>
+        <w:tab/>
+        <w:t>18</w:t>
       </w:r>
     </w:p>
     <w:p>
@@ -697,7 +734,7 @@
           <w:sz w:val="24"/>
         </w:rPr>
         <w:tab/>
-        <w:t>16</w:t>
+        <w:t>21</w:t>
       </w:r>
     </w:p>
     <w:p>
@@ -725,7 +762,7 @@
           <w:sz w:val="24"/>
         </w:rPr>
         <w:tab/>
-        <w:t>16</w:t>
+        <w:t>21</w:t>
       </w:r>
     </w:p>
     <w:p>
@@ -753,7 +790,7 @@
           <w:sz w:val="24"/>
         </w:rPr>
         <w:tab/>
-        <w:t>17</w:t>
+        <w:t>22</w:t>
       </w:r>
     </w:p>
     <w:p>
@@ -781,7 +818,7 @@
           <w:sz w:val="24"/>
         </w:rPr>
         <w:tab/>
-        <w:t>20</w:t>
+        <w:t>25</w:t>
       </w:r>
     </w:p>
     <w:p>
@@ -809,7 +846,7 @@
           <w:sz w:val="24"/>
         </w:rPr>
         <w:tab/>
-        <w:t>21</w:t>
+        <w:t>26</w:t>
       </w:r>
     </w:p>
     <w:p>
@@ -837,7 +874,7 @@
           <w:sz w:val="24"/>
         </w:rPr>
         <w:tab/>
-        <w:t>23</w:t>
+        <w:t>28</w:t>
       </w:r>
     </w:p>
     <w:p>
@@ -865,7 +902,7 @@
           <w:sz w:val="24"/>
         </w:rPr>
         <w:tab/>
-        <w:t>26</w:t>
+        <w:t>31</w:t>
       </w:r>
     </w:p>
     <w:p>
@@ -893,7 +930,7 @@
           <w:sz w:val="24"/>
         </w:rPr>
         <w:tab/>
-        <w:t>28</w:t>
+        <w:t>33</w:t>
       </w:r>
     </w:p>
     <w:p>
@@ -921,7 +958,7 @@
           <w:sz w:val="24"/>
         </w:rPr>
         <w:tab/>
-        <w:t>28</w:t>
+        <w:t>33</w:t>
       </w:r>
     </w:p>
     <w:p>
@@ -949,7 +986,7 @@
           <w:sz w:val="24"/>
         </w:rPr>
         <w:tab/>
-        <w:t>31</w:t>
+        <w:t>36</w:t>
       </w:r>
     </w:p>
     <w:p>
@@ -977,7 +1014,7 @@
           <w:sz w:val="24"/>
         </w:rPr>
         <w:tab/>
-        <w:t>37</w:t>
+        <w:t>42</w:t>
       </w:r>
     </w:p>
     <w:p>
@@ -1005,7 +1042,7 @@
           <w:sz w:val="24"/>
         </w:rPr>
         <w:tab/>
-        <w:t>38</w:t>
+        <w:t>43</w:t>
       </w:r>
     </w:p>
     <w:p>
@@ -1033,7 +1070,7 @@
           <w:sz w:val="24"/>
         </w:rPr>
         <w:tab/>
-        <w:t>39</w:t>
+        <w:t>44</w:t>
       </w:r>
     </w:p>
     <w:p>
@@ -1061,7 +1098,7 @@
           <w:sz w:val="24"/>
         </w:rPr>
         <w:tab/>
-        <w:t>41</w:t>
+        <w:t>46</w:t>
       </w:r>
     </w:p>
     <w:p>
@@ -1089,7 +1126,7 @@
           <w:sz w:val="24"/>
         </w:rPr>
         <w:tab/>
-        <w:t>41</w:t>
+        <w:t>46</w:t>
       </w:r>
     </w:p>
     <w:p>
@@ -1117,7 +1154,7 @@
           <w:sz w:val="24"/>
         </w:rPr>
         <w:tab/>
-        <w:t>43</w:t>
+        <w:t>48</w:t>
       </w:r>
     </w:p>
     <w:p>
@@ -1145,7 +1182,7 @@
           <w:sz w:val="24"/>
         </w:rPr>
         <w:tab/>
-        <w:t>45</w:t>
+        <w:t>50</w:t>
       </w:r>
     </w:p>
     <w:p>
@@ -1173,7 +1210,7 @@
           <w:sz w:val="24"/>
         </w:rPr>
         <w:tab/>
-        <w:t>50</w:t>
+        <w:t>55</w:t>
       </w:r>
     </w:p>
     <w:p>
@@ -1201,7 +1238,7 @@
           <w:sz w:val="24"/>
         </w:rPr>
         <w:tab/>
-        <w:t>51</w:t>
+        <w:t>56</w:t>
       </w:r>
     </w:p>
     <w:p>
@@ -1229,7 +1266,7 @@
           <w:sz w:val="24"/>
         </w:rPr>
         <w:tab/>
-        <w:t>52</w:t>
+        <w:t>57</w:t>
       </w:r>
     </w:p>
     <w:p>
@@ -1257,7 +1294,7 @@
           <w:sz w:val="24"/>
         </w:rPr>
         <w:tab/>
-        <w:t>53</w:t>
+        <w:t>58</w:t>
       </w:r>
     </w:p>
     <w:p>
@@ -1285,7 +1322,7 @@
           <w:sz w:val="24"/>
         </w:rPr>
         <w:tab/>
-        <w:t>54</w:t>
+        <w:t>59</w:t>
       </w:r>
     </w:p>
     <w:p>
@@ -1313,7 +1350,7 @@
           <w:sz w:val="24"/>
         </w:rPr>
         <w:tab/>
-        <w:t>55</w:t>
+        <w:t>60</w:t>
       </w:r>
     </w:p>
     <w:p>
@@ -1341,7 +1378,7 @@
           <w:sz w:val="24"/>
         </w:rPr>
         <w:tab/>
-        <w:t>57</w:t>
+        <w:t>62</w:t>
       </w:r>
     </w:p>
     <w:p>
@@ -1369,7 +1406,7 @@
           <w:sz w:val="24"/>
         </w:rPr>
         <w:tab/>
-        <w:t>57</w:t>
+        <w:t>62</w:t>
       </w:r>
     </w:p>
     <w:p>
@@ -1397,7 +1434,7 @@
           <w:sz w:val="24"/>
         </w:rPr>
         <w:tab/>
-        <w:t>58</w:t>
+        <w:t>63</w:t>
       </w:r>
     </w:p>
     <w:p>
@@ -1425,7 +1462,7 @@
           <w:sz w:val="24"/>
         </w:rPr>
         <w:tab/>
-        <w:t>58</w:t>
+        <w:t>64</w:t>
       </w:r>
     </w:p>
     <w:p>
@@ -1453,7 +1490,7 @@
           <w:sz w:val="24"/>
         </w:rPr>
         <w:tab/>
-        <w:t>59</w:t>
+        <w:t>64</w:t>
       </w:r>
     </w:p>
     <w:p>
@@ -1481,7 +1518,7 @@
           <w:sz w:val="24"/>
         </w:rPr>
         <w:tab/>
-        <w:t>59</w:t>
+        <w:t>65</w:t>
       </w:r>
     </w:p>
     <w:p>
@@ -1509,7 +1546,7 @@
           <w:sz w:val="24"/>
         </w:rPr>
         <w:tab/>
-        <w:t>60</w:t>
+        <w:t>65</w:t>
       </w:r>
     </w:p>
     <w:p>
@@ -1537,7 +1574,7 @@
           <w:sz w:val="24"/>
         </w:rPr>
         <w:tab/>
-        <w:t>61</w:t>
+        <w:t>66</w:t>
       </w:r>
     </w:p>
     <w:p>
@@ -1565,7 +1602,7 @@
           <w:sz w:val="24"/>
         </w:rPr>
         <w:tab/>
-        <w:t>61</w:t>
+        <w:t>66</w:t>
       </w:r>
     </w:p>
     <w:p>
@@ -1593,7 +1630,7 @@
           <w:sz w:val="24"/>
         </w:rPr>
         <w:tab/>
-        <w:t>61</w:t>
+        <w:t>67</w:t>
       </w:r>
     </w:p>
     <w:p>
@@ -1621,7 +1658,7 @@
           <w:sz w:val="24"/>
         </w:rPr>
         <w:tab/>
-        <w:t>62</w:t>
+        <w:t>67</w:t>
       </w:r>
     </w:p>
     <w:p>
@@ -1649,7 +1686,7 @@
           <w:sz w:val="24"/>
         </w:rPr>
         <w:tab/>
-        <w:t>63</w:t>
+        <w:t>69</w:t>
       </w:r>
     </w:p>
     <w:p>
@@ -1677,7 +1714,7 @@
           <w:sz w:val="24"/>
         </w:rPr>
         <w:tab/>
-        <w:t>67</w:t>
+        <w:t>73</w:t>
       </w:r>
     </w:p>
     <w:p>
@@ -1705,7 +1742,7 @@
           <w:sz w:val="24"/>
         </w:rPr>
         <w:tab/>
-        <w:t>67</w:t>
+        <w:t>73</w:t>
       </w:r>
     </w:p>
     <w:p>
@@ -1733,7 +1770,7 @@
           <w:sz w:val="24"/>
         </w:rPr>
         <w:tab/>
-        <w:t>69</w:t>
+        <w:t>75</w:t>
       </w:r>
     </w:p>
     <w:p>
@@ -1761,7 +1798,7 @@
           <w:sz w:val="24"/>
         </w:rPr>
         <w:tab/>
-        <w:t>70</w:t>
+        <w:t>76</w:t>
       </w:r>
     </w:p>
     <w:p>
@@ -1789,7 +1826,7 @@
           <w:sz w:val="24"/>
         </w:rPr>
         <w:tab/>
-        <w:t>72</w:t>
+        <w:t>78</w:t>
       </w:r>
     </w:p>
     <w:p>
@@ -1817,7 +1854,10 @@
           <w:sz w:val="24"/>
         </w:rPr>
         <w:tab/>
-        <w:t>73</w:t>
+        <w:t>79</w:t>
+      </w:r>
+      <w:r>
+        <w:fldChar w:fldCharType="end"/>
       </w:r>
     </w:p>
     <w:p>
@@ -1856,7 +1896,7 @@
           <w:color w:val="000000"/>
           <w:sz w:val="24"/>
         </w:rPr>
-        <w:t>AI编程助手正在大量生成和修改代码，但“AI说修好了”缺少可信的验收手段：业务测试只检查该做的事是否做了，密钥扫描和静态分析看不到运行时的凭据去向，让大模型审代码又给不出可核对的事实。</w:t>
+        <w:t>AI编程助手正在大量生成和修改代码，但“AI说修好了”缺少可信的验收手段：业务测试只检查该做的事是否做了，密钥扫描和静态分析看不到运行时行为，让大模型审代码又给不出可核对的事实。</w:t>
       </w:r>
     </w:p>
     <w:p>
@@ -1872,7 +1912,7 @@
           <w:color w:val="000000"/>
           <w:sz w:val="24"/>
         </w:rPr>
-        <w:t>密证CredProof是面向Python工具安全修改的可信验收与人机协同修复平台。它把被测代码放进一次性隔离副本中真实运行，用审计钩子、本地模拟服务和随机合成凭据记录文件、请求与凭据的实际去向，按14项必要条件给出通过、不通过、证据不足三值结论。“必须读到授权资料、必须完成授权认证”同样是通过条件，可识别一刀切拒绝和提前崩溃式的假修复。技术结论、人工决定与原项目应用三种状态分离，结论绑定确切的代码和报告摘要，材料一变即失效，导出包可在新目录重新执行复检。平台提供浏览器接入向导、五问证据视图、版本链修订、本地模型候选和CI门禁。</w:t>
+        <w:t>密证CredProof是面向Python工具安全修改的可信验收与人机协同修复平台。它在一次性隔离副本中真实运行代码，一次检查同时覆盖三类风险：凭据泄露（不泄密）、越界读取（不乱读）、未授权网络访问（不乱连），并确认必要业务仍然成立。按14项必要条件给出通过、不通过、证据不足三值结论，能识别一刀切拒绝和提前崩溃式的假修复。技术结论与人工决定分离，结论绑定确切代码，材料一变即失效，可在新目录复检。</w:t>
       </w:r>
     </w:p>
     <w:p>
@@ -1888,7 +1928,7 @@
           <w:color w:val="000000"/>
           <w:sz w:val="24"/>
         </w:rPr>
-        <w:t>在冻结的88条对照记录中，同批51个AI补丁有6个把凭据随跳转发往未授权服务，业务测试、凭据规则和两个本地大模型裁判全部放行，CredProof全部拦截；开源组件python-dotenv重新引入缺陷后117项测试全部通过，仍被判不通过。全部流程在本机运行，代码与凭据不出域。</w:t>
+        <w:t>浏览器上传项目即可接入；单次检查约1.6秒，不需要GPU和付费API，代码与凭据不出本机；同一检查器可直接作为CI合并门禁。在冻结的88条对照记录中，51个AI补丁有6个把凭据随跳转发往未授权服务，业务测试、凭据规则和两个大模型裁判全部放行，CredProof全部拦截；python-dotenv重新引入越界读取缺陷后117项测试全部通过，仍被判不通过。</w:t>
       </w:r>
     </w:p>
     <w:p>
@@ -1913,7 +1953,7 @@
           <w:color w:val="000000"/>
           <w:sz w:val="24"/>
         </w:rPr>
-        <w:t xml:space="preserve"> AI生成代码；安全修改验收；运行时证据；凭据泄露；人机协同；可复检</w:t>
+        <w:t xml:space="preserve"> AI生成代码；安全修改验收；凭据泄露；越界读取；未授权访问；人机协同</w:t>
       </w:r>
     </w:p>
     <w:p>
@@ -2045,7 +2085,61 @@
           <w:color w:val="000000"/>
           <w:sz w:val="24"/>
         </w:rPr>
-        <w:t>本作品研发过程中，我们让本地大模型实际修复存在安全缺陷的Python工具，反复观察到三种具有迷惑性的结果（数据见第三章）：</w:t>
+        <w:t>对“读本地文件、带凭据调用服务”的Python工具，安全修改要同时守住三件事：</w:t>
+      </w:r>
+      <w:r>
+        <w:rPr>
+          <w:rFonts w:ascii="宋体" w:hAnsi="宋体" w:eastAsia="宋体" w:cs="宋体"/>
+          <w:b/>
+          <w:color w:val="000000"/>
+          <w:sz w:val="24"/>
+        </w:rPr>
+        <w:t>不泄密</w:t>
+      </w:r>
+      <w:r>
+        <w:rPr>
+          <w:rFonts w:ascii="宋体" w:hAnsi="宋体" w:eastAsia="宋体" w:cs="宋体"/>
+          <w:b w:val="0"/>
+          <w:color w:val="000000"/>
+          <w:sz w:val="24"/>
+        </w:rPr>
+        <w:t>（凭据不进入日志、返回值、异常和输出）、</w:t>
+      </w:r>
+      <w:r>
+        <w:rPr>
+          <w:rFonts w:ascii="宋体" w:hAnsi="宋体" w:eastAsia="宋体" w:cs="宋体"/>
+          <w:b/>
+          <w:color w:val="000000"/>
+          <w:sz w:val="24"/>
+        </w:rPr>
+        <w:t>不乱读</w:t>
+      </w:r>
+      <w:r>
+        <w:rPr>
+          <w:rFonts w:ascii="宋体" w:hAnsi="宋体" w:eastAsia="宋体" w:cs="宋体"/>
+          <w:b w:val="0"/>
+          <w:color w:val="000000"/>
+          <w:sz w:val="24"/>
+        </w:rPr>
+        <w:t>（只读授权目录）、</w:t>
+      </w:r>
+      <w:r>
+        <w:rPr>
+          <w:rFonts w:ascii="宋体" w:hAnsi="宋体" w:eastAsia="宋体" w:cs="宋体"/>
+          <w:b/>
+          <w:color w:val="000000"/>
+          <w:sz w:val="24"/>
+        </w:rPr>
+        <w:t>不乱连</w:t>
+      </w:r>
+      <w:r>
+        <w:rPr>
+          <w:rFonts w:ascii="宋体" w:hAnsi="宋体" w:eastAsia="宋体" w:cs="宋体"/>
+          <w:b w:val="0"/>
+          <w:color w:val="000000"/>
+          <w:sz w:val="24"/>
+        </w:rPr>
+        <w:t>（只带凭据访问授权服务，不被跳转带走）。本作品研发过程中，我们让本地大模型实际修复这类工具，反复观察到三种具有迷惑性的结果（数据见第三章），分别对应乱连、业务未保持和乱读：</w:t>
       </w:r>
     </w:p>
     <w:p>
@@ -2800,16 +2894,16 @@
           <w:color w:val="000000"/>
           <w:sz w:val="24"/>
         </w:rPr>
-        <w:t>证据而非自述。</w:t>
-      </w:r>
-      <w:r>
-        <w:rPr>
-          <w:rFonts w:ascii="宋体" w:hAnsi="宋体" w:eastAsia="宋体" w:cs="宋体"/>
-          <w:b w:val="0"/>
-          <w:color w:val="000000"/>
-          <w:sz w:val="24"/>
-        </w:rPr>
-        <w:t xml:space="preserve"> 不读模型的解释，只信隔离运行得到的文件、请求、输出事实；凭据是每次随机生成的合成值。</w:t>
+        <w:t>三类风险一次检查。</w:t>
+      </w:r>
+      <w:r>
+        <w:rPr>
+          <w:rFonts w:ascii="宋体" w:hAnsi="宋体" w:eastAsia="宋体" w:cs="宋体"/>
+          <w:b w:val="0"/>
+          <w:color w:val="000000"/>
+          <w:sz w:val="24"/>
+        </w:rPr>
+        <w:t xml:space="preserve"> 同一次隔离运行同时判定不泄密、不乱读、不乱连，并确认必要业务仍然成立（表2）；不是只查凭据的扫描器，也不需要为每类风险各接一套工具。</w:t>
       </w:r>
     </w:p>
     <w:p>
@@ -2835,16 +2929,16 @@
           <w:color w:val="000000"/>
           <w:sz w:val="24"/>
         </w:rPr>
-        <w:t>双向判定。</w:t>
-      </w:r>
-      <w:r>
-        <w:rPr>
-          <w:rFonts w:ascii="宋体" w:hAnsi="宋体" w:eastAsia="宋体" w:cs="宋体"/>
-          <w:b w:val="0"/>
-          <w:color w:val="000000"/>
-          <w:sz w:val="24"/>
-        </w:rPr>
-        <w:t xml:space="preserve"> 既要求“没有泄密、没有乱读、没有乱连”，也要求“确实读到了授权资料、确实带凭据完成了认证、业务测试全部执行并通过”；证据缺失时判证据不足，绝不显示通过。</w:t>
+        <w:t>证据而非自述。</w:t>
+      </w:r>
+      <w:r>
+        <w:rPr>
+          <w:rFonts w:ascii="宋体" w:hAnsi="宋体" w:eastAsia="宋体" w:cs="宋体"/>
+          <w:b w:val="0"/>
+          <w:color w:val="000000"/>
+          <w:sz w:val="24"/>
+        </w:rPr>
+        <w:t xml:space="preserve"> 不读模型的解释，只信隔离运行得到的文件、请求、输出事实；凭据是每次随机生成的合成值。</w:t>
       </w:r>
     </w:p>
     <w:p>
@@ -2870,16 +2964,16 @@
           <w:color w:val="000000"/>
           <w:sz w:val="24"/>
         </w:rPr>
-        <w:t>三种状态分开。</w:t>
-      </w:r>
-      <w:r>
-        <w:rPr>
-          <w:rFonts w:ascii="宋体" w:hAnsi="宋体" w:eastAsia="宋体" w:cs="宋体"/>
-          <w:b w:val="0"/>
-          <w:color w:val="000000"/>
-          <w:sz w:val="24"/>
-        </w:rPr>
-        <w:t xml:space="preserve"> 程序给出技术结论，人给出采纳决定，系统从不自动写回原项目；任何一方都不能替另一方做决定。</w:t>
+        <w:t>双向判定。</w:t>
+      </w:r>
+      <w:r>
+        <w:rPr>
+          <w:rFonts w:ascii="宋体" w:hAnsi="宋体" w:eastAsia="宋体" w:cs="宋体"/>
+          <w:b w:val="0"/>
+          <w:color w:val="000000"/>
+          <w:sz w:val="24"/>
+        </w:rPr>
+        <w:t xml:space="preserve"> 既要求“没有泄密、没有乱读、没有乱连”，也要求“确实读到了授权资料、确实带凭据完成了认证、业务测试全部执行并通过”；证据缺失时判证据不足，绝不显示通过。</w:t>
       </w:r>
     </w:p>
     <w:p>
@@ -2905,16 +2999,16 @@
           <w:color w:val="000000"/>
           <w:sz w:val="24"/>
         </w:rPr>
-        <w:t>结论绑定对象。</w:t>
-      </w:r>
-      <w:r>
-        <w:rPr>
-          <w:rFonts w:ascii="宋体" w:hAnsi="宋体" w:eastAsia="宋体" w:cs="宋体"/>
-          <w:b w:val="0"/>
-          <w:color w:val="000000"/>
-          <w:sz w:val="24"/>
-        </w:rPr>
-        <w:t xml:space="preserve"> 报告、决定、导出包都绑定确切的代码、配置、测试与组件摘要；材料一变即失效，复检在新目录重新执行而不是读取旧结论。</w:t>
+        <w:t>三种状态分开。</w:t>
+      </w:r>
+      <w:r>
+        <w:rPr>
+          <w:rFonts w:ascii="宋体" w:hAnsi="宋体" w:eastAsia="宋体" w:cs="宋体"/>
+          <w:b w:val="0"/>
+          <w:color w:val="000000"/>
+          <w:sz w:val="24"/>
+        </w:rPr>
+        <w:t xml:space="preserve"> 程序给出技术结论，人给出采纳决定，系统从不自动写回原项目；任何一方都不能替另一方做决定。</w:t>
       </w:r>
     </w:p>
     <w:p>
@@ -2940,6 +3034,41 @@
           <w:color w:val="000000"/>
           <w:sz w:val="24"/>
         </w:rPr>
+        <w:t>结论绑定对象。</w:t>
+      </w:r>
+      <w:r>
+        <w:rPr>
+          <w:rFonts w:ascii="宋体" w:hAnsi="宋体" w:eastAsia="宋体" w:cs="宋体"/>
+          <w:b w:val="0"/>
+          <w:color w:val="000000"/>
+          <w:sz w:val="24"/>
+        </w:rPr>
+        <w:t xml:space="preserve"> 报告、决定、导出包都绑定确切的代码、配置、测试与组件摘要；材料一变即失效，复检在新目录重新执行而不是读取旧结论。</w:t>
+      </w:r>
+    </w:p>
+    <w:p>
+      <w:pPr>
+        <w:widowControl/>
+        <w:spacing w:line="360" w:lineRule="auto" w:before="0" w:after="60"/>
+        <w:ind w:left="480" w:hanging="360"/>
+        <w:jc w:val="left"/>
+      </w:pPr>
+      <w:r>
+        <w:rPr>
+          <w:rFonts w:ascii="宋体" w:hAnsi="宋体" w:eastAsia="宋体" w:cs="宋体"/>
+          <w:b w:val="0"/>
+          <w:color w:val="000000"/>
+          <w:sz w:val="24"/>
+        </w:rPr>
+        <w:t xml:space="preserve">6. </w:t>
+      </w:r>
+      <w:r>
+        <w:rPr>
+          <w:rFonts w:ascii="宋体" w:hAnsi="宋体" w:eastAsia="宋体" w:cs="宋体"/>
+          <w:b/>
+          <w:color w:val="000000"/>
+          <w:sz w:val="24"/>
+        </w:rPr>
         <w:t>一套检查器，三种入口。</w:t>
       </w:r>
       <w:r>
@@ -2951,6 +3080,596 @@
         </w:rPr>
         <w:t xml:space="preserve"> 浏览器工作台、命令行和CI流水线调用同一个检查器，输出同一份报告、SARIF与JUnit。</w:t>
       </w:r>
+    </w:p>
+    <w:p>
+      <w:pPr>
+        <w:widowControl/>
+        <w:spacing w:line="360" w:lineRule="auto" w:before="0" w:after="60"/>
+        <w:ind w:left="480" w:hanging="360"/>
+        <w:jc w:val="left"/>
+      </w:pPr>
+      <w:r>
+        <w:rPr>
+          <w:rFonts w:ascii="宋体" w:hAnsi="宋体" w:eastAsia="宋体" w:cs="宋体"/>
+          <w:b w:val="0"/>
+          <w:color w:val="000000"/>
+          <w:sz w:val="24"/>
+        </w:rPr>
+        <w:t xml:space="preserve">7. </w:t>
+      </w:r>
+      <w:r>
+        <w:rPr>
+          <w:rFonts w:ascii="宋体" w:hAnsi="宋体" w:eastAsia="宋体" w:cs="宋体"/>
+          <w:b/>
+          <w:color w:val="000000"/>
+          <w:sz w:val="24"/>
+        </w:rPr>
+        <w:t>不限修改来源。</w:t>
+      </w:r>
+      <w:r>
+        <w:rPr>
+          <w:rFonts w:ascii="宋体" w:hAnsi="宋体" w:eastAsia="宋体" w:cs="宋体"/>
+          <w:b w:val="0"/>
+          <w:color w:val="000000"/>
+          <w:sz w:val="24"/>
+        </w:rPr>
+        <w:t xml:space="preserve"> 验收对象是“修改后的代码”本身：AI生成、外包交付还是开发者手写的修改，都走同一套检查和同一条版本链。</w:t>
+      </w:r>
+    </w:p>
+    <w:p>
+      <w:pPr>
+        <w:keepNext/>
+        <w:widowControl/>
+        <w:spacing w:line="360" w:lineRule="auto" w:before="0" w:after="40"/>
+        <w:ind w:firstLine="0"/>
+        <w:jc w:val="center"/>
+      </w:pPr>
+      <w:r>
+        <w:rPr>
+          <w:rFonts w:ascii="宋体" w:hAnsi="宋体" w:eastAsia="宋体" w:cs="宋体"/>
+          <w:b w:val="0"/>
+          <w:color w:val="000000"/>
+          <w:sz w:val="24"/>
+        </w:rPr>
+        <w:t>表2 三类风险与业务保持：判定方式与本报告中的拦截实例</w:t>
+      </w:r>
+    </w:p>
+    <w:tbl>
+      <w:tblPr>
+        <w:tblW w:type="auto" w:w="0"/>
+        <w:jc w:val="center"/>
+        <w:tblLayout w:type="fixed"/>
+        <w:tblLook w:firstColumn="1" w:firstRow="1" w:lastColumn="0" w:lastRow="0" w:noHBand="0" w:noVBand="1" w:val="04A0"/>
+        <w:tblBorders>
+          <w:top w:val="single" w:sz="4" w:color="A6A6A6"/>
+          <w:left w:val="single" w:sz="4" w:color="A6A6A6"/>
+          <w:bottom w:val="single" w:sz="4" w:color="A6A6A6"/>
+          <w:right w:val="single" w:sz="4" w:color="A6A6A6"/>
+          <w:insideH w:val="single" w:sz="4" w:color="A6A6A6"/>
+          <w:insideV w:val="single" w:sz="4" w:color="A6A6A6"/>
+        </w:tblBorders>
+      </w:tblPr>
+      <w:tblGrid>
+        <w:gridCol w:w="1219"/>
+        <w:gridCol w:w="2138"/>
+        <w:gridCol w:w="2674"/>
+        <w:gridCol w:w="2586"/>
+      </w:tblGrid>
+      <w:tr>
+        <w:trPr>
+          <w:cantSplit/>
+          <w:tblHeader/>
+        </w:trPr>
+        <w:tc>
+          <w:tcPr>
+            <w:tcW w:type="dxa" w:w="1219"/>
+            <w:vAlign w:val="center"/>
+            <w:shd w:val="clear" w:fill="E7EEF0"/>
+          </w:tcPr>
+          <w:p>
+            <w:pPr>
+              <w:widowControl/>
+              <w:spacing w:line="360" w:lineRule="auto" w:before="0" w:after="0"/>
+              <w:ind w:firstLine="0"/>
+              <w:jc w:val="center"/>
+            </w:pPr>
+            <w:r>
+              <w:rPr>
+                <w:rFonts w:ascii="宋体" w:hAnsi="宋体" w:eastAsia="宋体" w:cs="宋体"/>
+                <w:b/>
+                <w:color w:val="000000"/>
+                <w:sz w:val="24"/>
+              </w:rPr>
+              <w:t>检查维度</w:t>
+            </w:r>
+          </w:p>
+        </w:tc>
+        <w:tc>
+          <w:tcPr>
+            <w:tcW w:type="dxa" w:w="2138"/>
+            <w:vAlign w:val="center"/>
+            <w:shd w:val="clear" w:fill="E7EEF0"/>
+          </w:tcPr>
+          <w:p>
+            <w:pPr>
+              <w:widowControl/>
+              <w:spacing w:line="360" w:lineRule="auto" w:before="0" w:after="0"/>
+              <w:ind w:firstLine="0"/>
+              <w:jc w:val="center"/>
+            </w:pPr>
+            <w:r>
+              <w:rPr>
+                <w:rFonts w:ascii="宋体" w:hAnsi="宋体" w:eastAsia="宋体" w:cs="宋体"/>
+                <w:b/>
+                <w:color w:val="000000"/>
+                <w:sz w:val="24"/>
+              </w:rPr>
+              <w:t>典型问题</w:t>
+            </w:r>
+          </w:p>
+        </w:tc>
+        <w:tc>
+          <w:tcPr>
+            <w:tcW w:type="dxa" w:w="2674"/>
+            <w:vAlign w:val="center"/>
+            <w:shd w:val="clear" w:fill="E7EEF0"/>
+          </w:tcPr>
+          <w:p>
+            <w:pPr>
+              <w:widowControl/>
+              <w:spacing w:line="360" w:lineRule="auto" w:before="0" w:after="0"/>
+              <w:ind w:firstLine="0"/>
+              <w:jc w:val="center"/>
+            </w:pPr>
+            <w:r>
+              <w:rPr>
+                <w:rFonts w:ascii="宋体" w:hAnsi="宋体" w:eastAsia="宋体" w:cs="宋体"/>
+                <w:b/>
+                <w:color w:val="000000"/>
+                <w:sz w:val="24"/>
+              </w:rPr>
+              <w:t>判定依据（14项条件中的）</w:t>
+            </w:r>
+          </w:p>
+        </w:tc>
+        <w:tc>
+          <w:tcPr>
+            <w:tcW w:type="dxa" w:w="2586"/>
+            <w:vAlign w:val="center"/>
+            <w:shd w:val="clear" w:fill="E7EEF0"/>
+          </w:tcPr>
+          <w:p>
+            <w:pPr>
+              <w:widowControl/>
+              <w:spacing w:line="360" w:lineRule="auto" w:before="0" w:after="0"/>
+              <w:ind w:firstLine="0"/>
+              <w:jc w:val="center"/>
+            </w:pPr>
+            <w:r>
+              <w:rPr>
+                <w:rFonts w:ascii="宋体" w:hAnsi="宋体" w:eastAsia="宋体" w:cs="宋体"/>
+                <w:b/>
+                <w:color w:val="000000"/>
+                <w:sz w:val="24"/>
+              </w:rPr>
+              <w:t>本报告中的实例</w:t>
+            </w:r>
+          </w:p>
+        </w:tc>
+      </w:tr>
+      <w:tr>
+        <w:trPr>
+          <w:cantSplit/>
+        </w:trPr>
+        <w:tc>
+          <w:tcPr>
+            <w:tcW w:type="dxa" w:w="1219"/>
+            <w:vAlign w:val="center"/>
+          </w:tcPr>
+          <w:p>
+            <w:pPr>
+              <w:widowControl/>
+              <w:spacing w:line="360" w:lineRule="auto" w:before="0" w:after="0"/>
+              <w:ind w:firstLine="0"/>
+              <w:jc w:val="left"/>
+            </w:pPr>
+            <w:r>
+              <w:rPr>
+                <w:rFonts w:ascii="宋体" w:hAnsi="宋体" w:eastAsia="宋体" w:cs="宋体"/>
+                <w:b w:val="0"/>
+                <w:color w:val="000000"/>
+                <w:sz w:val="24"/>
+              </w:rPr>
+              <w:t>不泄密（凭据泄露）</w:t>
+            </w:r>
+          </w:p>
+        </w:tc>
+        <w:tc>
+          <w:tcPr>
+            <w:tcW w:type="dxa" w:w="2138"/>
+            <w:vAlign w:val="center"/>
+          </w:tcPr>
+          <w:p>
+            <w:pPr>
+              <w:widowControl/>
+              <w:spacing w:line="360" w:lineRule="auto" w:before="0" w:after="0"/>
+              <w:ind w:firstLine="0"/>
+              <w:jc w:val="left"/>
+            </w:pPr>
+            <w:r>
+              <w:rPr>
+                <w:rFonts w:ascii="宋体" w:hAnsi="宋体" w:eastAsia="宋体" w:cs="宋体"/>
+                <w:b w:val="0"/>
+                <w:color w:val="000000"/>
+                <w:sz w:val="24"/>
+              </w:rPr>
+              <w:t>凭据写进日志、返回值、异常信息或命令行输出</w:t>
+            </w:r>
+          </w:p>
+        </w:tc>
+        <w:tc>
+          <w:tcPr>
+            <w:tcW w:type="dxa" w:w="2674"/>
+            <w:vAlign w:val="center"/>
+          </w:tcPr>
+          <w:p>
+            <w:pPr>
+              <w:widowControl/>
+              <w:spacing w:line="360" w:lineRule="auto" w:before="0" w:after="0"/>
+              <w:ind w:firstLine="0"/>
+              <w:jc w:val="left"/>
+            </w:pPr>
+            <w:r>
+              <w:rPr>
+                <w:rFonts w:ascii="宋体" w:hAnsi="宋体" w:eastAsia="宋体" w:cs="宋体"/>
+                <w:b w:val="0"/>
+                <w:color w:val="000000"/>
+                <w:sz w:val="24"/>
+              </w:rPr>
+              <w:t>返回值、输出、日志、异常中都不出现本次合成凭据</w:t>
+            </w:r>
+          </w:p>
+        </w:tc>
+        <w:tc>
+          <w:tcPr>
+            <w:tcW w:type="dxa" w:w="2586"/>
+            <w:vAlign w:val="center"/>
+          </w:tcPr>
+          <w:p>
+            <w:pPr>
+              <w:widowControl/>
+              <w:spacing w:line="360" w:lineRule="auto" w:before="0" w:after="0"/>
+              <w:ind w:firstLine="0"/>
+              <w:jc w:val="left"/>
+            </w:pPr>
+            <w:r>
+              <w:rPr>
+                <w:rFonts w:ascii="宋体" w:hAnsi="宋体" w:eastAsia="宋体" w:cs="宋体"/>
+                <w:b w:val="0"/>
+                <w:color w:val="000000"/>
+                <w:sz w:val="24"/>
+              </w:rPr>
+              <w:t>B01–B04四个目标；资料助手原问题凭据出现在日志、返回值、标准输出3个通道</w:t>
+            </w:r>
+          </w:p>
+        </w:tc>
+      </w:tr>
+      <w:tr>
+        <w:trPr>
+          <w:cantSplit/>
+        </w:trPr>
+        <w:tc>
+          <w:tcPr>
+            <w:tcW w:type="dxa" w:w="1219"/>
+            <w:vAlign w:val="center"/>
+          </w:tcPr>
+          <w:p>
+            <w:pPr>
+              <w:widowControl/>
+              <w:spacing w:line="360" w:lineRule="auto" w:before="0" w:after="0"/>
+              <w:ind w:firstLine="0"/>
+              <w:jc w:val="left"/>
+            </w:pPr>
+            <w:r>
+              <w:rPr>
+                <w:rFonts w:ascii="宋体" w:hAnsi="宋体" w:eastAsia="宋体" w:cs="宋体"/>
+                <w:b w:val="0"/>
+                <w:color w:val="000000"/>
+                <w:sz w:val="24"/>
+              </w:rPr>
+              <w:t>不乱读（越界读取）</w:t>
+            </w:r>
+          </w:p>
+        </w:tc>
+        <w:tc>
+          <w:tcPr>
+            <w:tcW w:type="dxa" w:w="2138"/>
+            <w:vAlign w:val="center"/>
+          </w:tcPr>
+          <w:p>
+            <w:pPr>
+              <w:widowControl/>
+              <w:spacing w:line="360" w:lineRule="auto" w:before="0" w:after="0"/>
+              <w:ind w:firstLine="0"/>
+              <w:jc w:val="left"/>
+            </w:pPr>
+            <w:r>
+              <w:rPr>
+                <w:rFonts w:ascii="宋体" w:hAnsi="宋体" w:eastAsia="宋体" w:cs="宋体"/>
+                <w:b w:val="0"/>
+                <w:color w:val="000000"/>
+                <w:sz w:val="24"/>
+              </w:rPr>
+              <w:t>直接打开请求给的路径；</w:t>
+            </w:r>
+            <w:r>
+              <w:rPr>
+                <w:rFonts w:ascii="宋体" w:hAnsi="宋体" w:eastAsia="宋体" w:cs="宋体"/>
+                <w:b w:val="0"/>
+                <w:color w:val="000000"/>
+                <w:sz w:val="24"/>
+              </w:rPr>
+              <w:t>../</w:t>
+            </w:r>
+            <w:r>
+              <w:rPr>
+                <w:rFonts w:ascii="宋体" w:hAnsi="宋体" w:eastAsia="宋体" w:cs="宋体"/>
+                <w:b w:val="0"/>
+                <w:color w:val="000000"/>
+                <w:sz w:val="24"/>
+              </w:rPr>
+              <w:t>穿越、符号链接绕过前缀校验</w:t>
+            </w:r>
+          </w:p>
+        </w:tc>
+        <w:tc>
+          <w:tcPr>
+            <w:tcW w:type="dxa" w:w="2674"/>
+            <w:vAlign w:val="center"/>
+          </w:tcPr>
+          <w:p>
+            <w:pPr>
+              <w:widowControl/>
+              <w:spacing w:line="360" w:lineRule="auto" w:before="0" w:after="0"/>
+              <w:ind w:firstLine="0"/>
+              <w:jc w:val="left"/>
+            </w:pPr>
+            <w:r>
+              <w:rPr>
+                <w:rFonts w:ascii="宋体" w:hAnsi="宋体" w:eastAsia="宋体" w:cs="宋体"/>
+                <w:b w:val="0"/>
+                <w:color w:val="000000"/>
+                <w:sz w:val="24"/>
+              </w:rPr>
+              <w:t>未读禁止目录、未读范围外文件；必须实际读取允许资料</w:t>
+            </w:r>
+          </w:p>
+        </w:tc>
+        <w:tc>
+          <w:tcPr>
+            <w:tcW w:type="dxa" w:w="2586"/>
+            <w:vAlign w:val="center"/>
+          </w:tcPr>
+          <w:p>
+            <w:pPr>
+              <w:widowControl/>
+              <w:spacing w:line="360" w:lineRule="auto" w:before="0" w:after="0"/>
+              <w:ind w:firstLine="0"/>
+              <w:jc w:val="left"/>
+            </w:pPr>
+            <w:r>
+              <w:rPr>
+                <w:rFonts w:ascii="宋体" w:hAnsi="宋体" w:eastAsia="宋体" w:cs="宋体"/>
+                <w:b w:val="0"/>
+                <w:color w:val="000000"/>
+                <w:sz w:val="24"/>
+              </w:rPr>
+              <w:t>B05、B06；资料助手读取secrets/secret.txt；python-dotenv越界缺陷</w:t>
+            </w:r>
+          </w:p>
+        </w:tc>
+      </w:tr>
+      <w:tr>
+        <w:trPr>
+          <w:cantSplit/>
+        </w:trPr>
+        <w:tc>
+          <w:tcPr>
+            <w:tcW w:type="dxa" w:w="1219"/>
+            <w:vAlign w:val="center"/>
+          </w:tcPr>
+          <w:p>
+            <w:pPr>
+              <w:widowControl/>
+              <w:spacing w:line="360" w:lineRule="auto" w:before="0" w:after="0"/>
+              <w:ind w:firstLine="0"/>
+              <w:jc w:val="left"/>
+            </w:pPr>
+            <w:r>
+              <w:rPr>
+                <w:rFonts w:ascii="宋体" w:hAnsi="宋体" w:eastAsia="宋体" w:cs="宋体"/>
+                <w:b w:val="0"/>
+                <w:color w:val="000000"/>
+                <w:sz w:val="24"/>
+              </w:rPr>
+              <w:t>不乱连（未授权访问）</w:t>
+            </w:r>
+          </w:p>
+        </w:tc>
+        <w:tc>
+          <w:tcPr>
+            <w:tcW w:type="dxa" w:w="2138"/>
+            <w:vAlign w:val="center"/>
+          </w:tcPr>
+          <w:p>
+            <w:pPr>
+              <w:widowControl/>
+              <w:spacing w:line="360" w:lineRule="auto" w:before="0" w:after="0"/>
+              <w:ind w:firstLine="0"/>
+              <w:jc w:val="left"/>
+            </w:pPr>
+            <w:r>
+              <w:rPr>
+                <w:rFonts w:ascii="宋体" w:hAnsi="宋体" w:eastAsia="宋体" w:cs="宋体"/>
+                <w:b w:val="0"/>
+                <w:color w:val="000000"/>
+                <w:sz w:val="24"/>
+              </w:rPr>
+              <w:t>跟随跳转把认证头带到其他服务；任意地址都带令牌访问</w:t>
+            </w:r>
+          </w:p>
+        </w:tc>
+        <w:tc>
+          <w:tcPr>
+            <w:tcW w:type="dxa" w:w="2674"/>
+            <w:vAlign w:val="center"/>
+          </w:tcPr>
+          <w:p>
+            <w:pPr>
+              <w:widowControl/>
+              <w:spacing w:line="360" w:lineRule="auto" w:before="0" w:after="0"/>
+              <w:ind w:firstLine="0"/>
+              <w:jc w:val="left"/>
+            </w:pPr>
+            <w:r>
+              <w:rPr>
+                <w:rFonts w:ascii="宋体" w:hAnsi="宋体" w:eastAsia="宋体" w:cs="宋体"/>
+                <w:b w:val="0"/>
+                <w:color w:val="000000"/>
+                <w:sz w:val="24"/>
+              </w:rPr>
+              <w:t>禁止服务未收到请求、无未授权连接、路径在允许前缀内；必须带凭据访问允许服务</w:t>
+            </w:r>
+          </w:p>
+        </w:tc>
+        <w:tc>
+          <w:tcPr>
+            <w:tcW w:type="dxa" w:w="2586"/>
+            <w:vAlign w:val="center"/>
+          </w:tcPr>
+          <w:p>
+            <w:pPr>
+              <w:widowControl/>
+              <w:spacing w:line="360" w:lineRule="auto" w:before="0" w:after="0"/>
+              <w:ind w:firstLine="0"/>
+              <w:jc w:val="left"/>
+            </w:pPr>
+            <w:r>
+              <w:rPr>
+                <w:rFonts w:ascii="宋体" w:hAnsi="宋体" w:eastAsia="宋体" w:cs="宋体"/>
+                <w:b w:val="0"/>
+                <w:color w:val="000000"/>
+                <w:sz w:val="24"/>
+              </w:rPr>
+              <w:t>B07、B08；同批6个AI补丁；CI实验中的含缺陷拉取请求</w:t>
+            </w:r>
+          </w:p>
+        </w:tc>
+      </w:tr>
+      <w:tr>
+        <w:trPr>
+          <w:cantSplit/>
+        </w:trPr>
+        <w:tc>
+          <w:tcPr>
+            <w:tcW w:type="dxa" w:w="1219"/>
+            <w:vAlign w:val="center"/>
+          </w:tcPr>
+          <w:p>
+            <w:pPr>
+              <w:widowControl/>
+              <w:spacing w:line="360" w:lineRule="auto" w:before="0" w:after="0"/>
+              <w:ind w:firstLine="0"/>
+              <w:jc w:val="center"/>
+            </w:pPr>
+            <w:r>
+              <w:rPr>
+                <w:rFonts w:ascii="宋体" w:hAnsi="宋体" w:eastAsia="宋体" w:cs="宋体"/>
+                <w:b w:val="0"/>
+                <w:color w:val="000000"/>
+                <w:sz w:val="24"/>
+              </w:rPr>
+              <w:t>业务保持</w:t>
+            </w:r>
+          </w:p>
+        </w:tc>
+        <w:tc>
+          <w:tcPr>
+            <w:tcW w:type="dxa" w:w="2138"/>
+            <w:vAlign w:val="center"/>
+          </w:tcPr>
+          <w:p>
+            <w:pPr>
+              <w:widowControl/>
+              <w:spacing w:line="360" w:lineRule="auto" w:before="0" w:after="0"/>
+              <w:ind w:firstLine="0"/>
+              <w:jc w:val="left"/>
+            </w:pPr>
+            <w:r>
+              <w:rPr>
+                <w:rFonts w:ascii="宋体" w:hAnsi="宋体" w:eastAsia="宋体" w:cs="宋体"/>
+                <w:b w:val="0"/>
+                <w:color w:val="000000"/>
+                <w:sz w:val="24"/>
+              </w:rPr>
+              <w:t>修复后功能被破坏；一刀切拒绝；入口提前崩溃</w:t>
+            </w:r>
+          </w:p>
+        </w:tc>
+        <w:tc>
+          <w:tcPr>
+            <w:tcW w:type="dxa" w:w="2674"/>
+            <w:vAlign w:val="center"/>
+          </w:tcPr>
+          <w:p>
+            <w:pPr>
+              <w:widowControl/>
+              <w:spacing w:line="360" w:lineRule="auto" w:before="0" w:after="0"/>
+              <w:ind w:firstLine="0"/>
+              <w:jc w:val="left"/>
+            </w:pPr>
+            <w:r>
+              <w:rPr>
+                <w:rFonts w:ascii="宋体" w:hAnsi="宋体" w:eastAsia="宋体" w:cs="宋体"/>
+                <w:b w:val="0"/>
+                <w:color w:val="000000"/>
+                <w:sz w:val="24"/>
+              </w:rPr>
+              <w:t>必要测试全部执行并通过；入口完成；每个场景得到预期结果</w:t>
+            </w:r>
+          </w:p>
+        </w:tc>
+        <w:tc>
+          <w:tcPr>
+            <w:tcW w:type="dxa" w:w="2586"/>
+            <w:vAlign w:val="center"/>
+          </w:tcPr>
+          <w:p>
+            <w:pPr>
+              <w:widowControl/>
+              <w:spacing w:line="360" w:lineRule="auto" w:before="0" w:after="0"/>
+              <w:ind w:firstLine="0"/>
+              <w:jc w:val="left"/>
+            </w:pPr>
+            <w:r>
+              <w:rPr>
+                <w:rFonts w:ascii="宋体" w:hAnsi="宋体" w:eastAsia="宋体" w:cs="宋体"/>
+                <w:b w:val="0"/>
+                <w:color w:val="000000"/>
+                <w:sz w:val="24"/>
+              </w:rPr>
+              <w:t>AI候选v000；实验四的模型候选</w:t>
+            </w:r>
+          </w:p>
+        </w:tc>
+      </w:tr>
+    </w:tbl>
+    <w:p>
+      <w:pPr>
+        <w:widowControl/>
+        <w:spacing w:line="192" w:lineRule="auto" w:before="0" w:after="0"/>
+        <w:ind w:firstLine="0"/>
+      </w:pPr>
     </w:p>
     <w:p>
       <w:pPr>
@@ -3045,7 +3764,7 @@
           <w:color w:val="000000"/>
           <w:sz w:val="24"/>
         </w:rPr>
-        <w:t>表2 目标用户与价值</w:t>
+        <w:t>表3 目标用户与价值</w:t>
       </w:r>
     </w:p>
     <w:tbl>
@@ -3515,7 +4234,7 @@
           <w:color w:val="000000"/>
           <w:sz w:val="24"/>
         </w:rPr>
-        <w:t>表3 产品形态与推广路径</w:t>
+        <w:t>表4 产品形态与推广路径</w:t>
       </w:r>
     </w:p>
     <w:tbl>
@@ -3941,6 +4660,568 @@
       </w:pPr>
     </w:p>
     <w:p>
+      <w:pPr>
+        <w:pStyle w:val="Heading2"/>
+        <w:keepNext/>
+        <w:spacing w:before="160" w:after="80" w:line="360" w:lineRule="auto"/>
+        <w:ind w:firstLine="0"/>
+        <w:jc w:val="left"/>
+      </w:pPr>
+      <w:r>
+        <w:rPr>
+          <w:rFonts w:ascii="黑体" w:hAnsi="黑体" w:eastAsia="黑体" w:cs="黑体"/>
+          <w:b/>
+          <w:color w:val="000000"/>
+          <w:sz w:val="28"/>
+        </w:rPr>
+        <w:t>1.6 实用性：直接进入日常开发流程</w:t>
+      </w:r>
+    </w:p>
+    <w:p>
+      <w:pPr>
+        <w:widowControl/>
+        <w:spacing w:line="360" w:lineRule="auto" w:before="0" w:after="60"/>
+        <w:ind w:firstLine="480"/>
+      </w:pPr>
+      <w:r>
+        <w:rPr>
+          <w:rFonts w:ascii="宋体" w:hAnsi="宋体" w:eastAsia="宋体" w:cs="宋体"/>
+          <w:b w:val="0"/>
+          <w:color w:val="000000"/>
+          <w:sz w:val="24"/>
+        </w:rPr>
+        <w:t>CredProof不是演示原型，而是可以直接放进团队日常流程的工具。它的实用性体现在五个方面（表5）：</w:t>
+      </w:r>
+    </w:p>
+    <w:p>
+      <w:pPr>
+        <w:keepNext/>
+        <w:widowControl/>
+        <w:spacing w:line="360" w:lineRule="auto" w:before="0" w:after="40"/>
+        <w:ind w:firstLine="0"/>
+        <w:jc w:val="center"/>
+      </w:pPr>
+      <w:r>
+        <w:rPr>
+          <w:rFonts w:ascii="宋体" w:hAnsi="宋体" w:eastAsia="宋体" w:cs="宋体"/>
+          <w:b w:val="0"/>
+          <w:color w:val="000000"/>
+          <w:sz w:val="24"/>
+        </w:rPr>
+        <w:t>表5 实用性要点</w:t>
+      </w:r>
+    </w:p>
+    <w:tbl>
+      <w:tblPr>
+        <w:tblW w:type="auto" w:w="0"/>
+        <w:jc w:val="center"/>
+        <w:tblLayout w:type="fixed"/>
+        <w:tblLook w:firstColumn="1" w:firstRow="1" w:lastColumn="0" w:lastRow="0" w:noHBand="0" w:noVBand="1" w:val="04A0"/>
+        <w:tblBorders>
+          <w:top w:val="single" w:sz="4" w:color="A6A6A6"/>
+          <w:left w:val="single" w:sz="4" w:color="A6A6A6"/>
+          <w:bottom w:val="single" w:sz="4" w:color="A6A6A6"/>
+          <w:right w:val="single" w:sz="4" w:color="A6A6A6"/>
+          <w:insideH w:val="single" w:sz="4" w:color="A6A6A6"/>
+          <w:insideV w:val="single" w:sz="4" w:color="A6A6A6"/>
+        </w:tblBorders>
+      </w:tblPr>
+      <w:tblGrid>
+        <w:gridCol w:w="1652"/>
+        <w:gridCol w:w="5607"/>
+        <w:gridCol w:w="1359"/>
+      </w:tblGrid>
+      <w:tr>
+        <w:trPr>
+          <w:cantSplit/>
+          <w:tblHeader/>
+        </w:trPr>
+        <w:tc>
+          <w:tcPr>
+            <w:tcW w:type="dxa" w:w="1652"/>
+            <w:vAlign w:val="center"/>
+            <w:shd w:val="clear" w:fill="E7EEF0"/>
+          </w:tcPr>
+          <w:p>
+            <w:pPr>
+              <w:widowControl/>
+              <w:spacing w:line="360" w:lineRule="auto" w:before="0" w:after="0"/>
+              <w:ind w:firstLine="0"/>
+              <w:jc w:val="center"/>
+            </w:pPr>
+            <w:r>
+              <w:rPr>
+                <w:rFonts w:ascii="宋体" w:hAnsi="宋体" w:eastAsia="宋体" w:cs="宋体"/>
+                <w:b/>
+                <w:color w:val="000000"/>
+                <w:sz w:val="24"/>
+              </w:rPr>
+              <w:t>维度</w:t>
+            </w:r>
+          </w:p>
+        </w:tc>
+        <w:tc>
+          <w:tcPr>
+            <w:tcW w:type="dxa" w:w="5607"/>
+            <w:vAlign w:val="center"/>
+            <w:shd w:val="clear" w:fill="E7EEF0"/>
+          </w:tcPr>
+          <w:p>
+            <w:pPr>
+              <w:widowControl/>
+              <w:spacing w:line="360" w:lineRule="auto" w:before="0" w:after="0"/>
+              <w:ind w:firstLine="0"/>
+              <w:jc w:val="center"/>
+            </w:pPr>
+            <w:r>
+              <w:rPr>
+                <w:rFonts w:ascii="宋体" w:hAnsi="宋体" w:eastAsia="宋体" w:cs="宋体"/>
+                <w:b/>
+                <w:color w:val="000000"/>
+                <w:sz w:val="24"/>
+              </w:rPr>
+              <w:t>具体做法</w:t>
+            </w:r>
+          </w:p>
+        </w:tc>
+        <w:tc>
+          <w:tcPr>
+            <w:tcW w:type="dxa" w:w="1359"/>
+            <w:vAlign w:val="center"/>
+            <w:shd w:val="clear" w:fill="E7EEF0"/>
+          </w:tcPr>
+          <w:p>
+            <w:pPr>
+              <w:widowControl/>
+              <w:spacing w:line="360" w:lineRule="auto" w:before="0" w:after="0"/>
+              <w:ind w:firstLine="0"/>
+              <w:jc w:val="center"/>
+            </w:pPr>
+            <w:r>
+              <w:rPr>
+                <w:rFonts w:ascii="宋体" w:hAnsi="宋体" w:eastAsia="宋体" w:cs="宋体"/>
+                <w:b/>
+                <w:color w:val="000000"/>
+                <w:sz w:val="24"/>
+              </w:rPr>
+              <w:t>依据</w:t>
+            </w:r>
+          </w:p>
+        </w:tc>
+      </w:tr>
+      <w:tr>
+        <w:trPr>
+          <w:cantSplit/>
+        </w:trPr>
+        <w:tc>
+          <w:tcPr>
+            <w:tcW w:type="dxa" w:w="1652"/>
+            <w:vAlign w:val="center"/>
+          </w:tcPr>
+          <w:p>
+            <w:pPr>
+              <w:widowControl/>
+              <w:spacing w:line="360" w:lineRule="auto" w:before="0" w:after="0"/>
+              <w:ind w:firstLine="0"/>
+              <w:jc w:val="center"/>
+            </w:pPr>
+            <w:r>
+              <w:rPr>
+                <w:rFonts w:ascii="宋体" w:hAnsi="宋体" w:eastAsia="宋体" w:cs="宋体"/>
+                <w:b w:val="0"/>
+                <w:color w:val="000000"/>
+                <w:sz w:val="24"/>
+              </w:rPr>
+              <w:t>接入快</w:t>
+            </w:r>
+          </w:p>
+        </w:tc>
+        <w:tc>
+          <w:tcPr>
+            <w:tcW w:type="dxa" w:w="5607"/>
+            <w:vAlign w:val="center"/>
+          </w:tcPr>
+          <w:p>
+            <w:pPr>
+              <w:widowControl/>
+              <w:spacing w:line="360" w:lineRule="auto" w:before="0" w:after="0"/>
+              <w:ind w:firstLine="0"/>
+              <w:jc w:val="left"/>
+            </w:pPr>
+            <w:r>
+              <w:rPr>
+                <w:rFonts w:ascii="宋体" w:hAnsi="宋体" w:eastAsia="宋体" w:cs="宋体"/>
+                <w:b w:val="0"/>
+                <w:color w:val="000000"/>
+                <w:sz w:val="24"/>
+              </w:rPr>
+              <w:t>浏览器选择项目文件夹或压缩包上传，静态解析自动找出入口函数、测试目录和凭据环境变量并预填配置；向导逐项校验；也可用命令行</w:t>
+            </w:r>
+            <w:r>
+              <w:rPr>
+                <w:rFonts w:ascii="宋体" w:hAnsi="宋体" w:eastAsia="宋体" w:cs="宋体"/>
+                <w:b w:val="0"/>
+                <w:color w:val="000000"/>
+                <w:sz w:val="24"/>
+              </w:rPr>
+              <w:t>init</w:t>
+            </w:r>
+            <w:r>
+              <w:rPr>
+                <w:rFonts w:ascii="宋体" w:hAnsi="宋体" w:eastAsia="宋体" w:cs="宋体"/>
+                <w:b w:val="0"/>
+                <w:color w:val="000000"/>
+                <w:sz w:val="24"/>
+              </w:rPr>
+              <w:t>生成配置</w:t>
+            </w:r>
+          </w:p>
+        </w:tc>
+        <w:tc>
+          <w:tcPr>
+            <w:tcW w:type="dxa" w:w="1359"/>
+            <w:vAlign w:val="center"/>
+          </w:tcPr>
+          <w:p>
+            <w:pPr>
+              <w:widowControl/>
+              <w:spacing w:line="360" w:lineRule="auto" w:before="0" w:after="0"/>
+              <w:ind w:firstLine="0"/>
+              <w:jc w:val="left"/>
+            </w:pPr>
+            <w:r>
+              <w:rPr>
+                <w:rFonts w:ascii="宋体" w:hAnsi="宋体" w:eastAsia="宋体" w:cs="宋体"/>
+                <w:b w:val="0"/>
+                <w:color w:val="000000"/>
+                <w:sz w:val="24"/>
+              </w:rPr>
+              <w:t>2.9节；附录一</w:t>
+            </w:r>
+          </w:p>
+        </w:tc>
+      </w:tr>
+      <w:tr>
+        <w:trPr>
+          <w:cantSplit/>
+        </w:trPr>
+        <w:tc>
+          <w:tcPr>
+            <w:tcW w:type="dxa" w:w="1652"/>
+            <w:vAlign w:val="center"/>
+          </w:tcPr>
+          <w:p>
+            <w:pPr>
+              <w:widowControl/>
+              <w:spacing w:line="360" w:lineRule="auto" w:before="0" w:after="0"/>
+              <w:ind w:firstLine="0"/>
+              <w:jc w:val="left"/>
+            </w:pPr>
+            <w:r>
+              <w:rPr>
+                <w:rFonts w:ascii="宋体" w:hAnsi="宋体" w:eastAsia="宋体" w:cs="宋体"/>
+                <w:b w:val="0"/>
+                <w:color w:val="000000"/>
+                <w:sz w:val="24"/>
+              </w:rPr>
+              <w:t>跑得快、成本低</w:t>
+            </w:r>
+          </w:p>
+        </w:tc>
+        <w:tc>
+          <w:tcPr>
+            <w:tcW w:type="dxa" w:w="5607"/>
+            <w:vAlign w:val="center"/>
+          </w:tcPr>
+          <w:p>
+            <w:pPr>
+              <w:widowControl/>
+              <w:spacing w:line="360" w:lineRule="auto" w:before="0" w:after="0"/>
+              <w:ind w:firstLine="0"/>
+              <w:jc w:val="left"/>
+            </w:pPr>
+            <w:r>
+              <w:rPr>
+                <w:rFonts w:ascii="宋体" w:hAnsi="宋体" w:eastAsia="宋体" w:cs="宋体"/>
+                <w:b w:val="0"/>
+                <w:color w:val="000000"/>
+                <w:sz w:val="24"/>
+              </w:rPr>
+              <w:t>单次完整检查中位数1.62秒；查看、修订、审批、复检都不需要GPU；不调用付费API；Windows交付包解压即可使用</w:t>
+            </w:r>
+          </w:p>
+        </w:tc>
+        <w:tc>
+          <w:tcPr>
+            <w:tcW w:type="dxa" w:w="1359"/>
+            <w:vAlign w:val="center"/>
+          </w:tcPr>
+          <w:p>
+            <w:pPr>
+              <w:widowControl/>
+              <w:spacing w:line="360" w:lineRule="auto" w:before="0" w:after="0"/>
+              <w:ind w:firstLine="0"/>
+              <w:jc w:val="center"/>
+            </w:pPr>
+            <w:r>
+              <w:rPr>
+                <w:rFonts w:ascii="宋体" w:hAnsi="宋体" w:eastAsia="宋体" w:cs="宋体"/>
+                <w:b w:val="0"/>
+                <w:color w:val="000000"/>
+                <w:sz w:val="24"/>
+              </w:rPr>
+              <w:t>3.8节</w:t>
+            </w:r>
+          </w:p>
+        </w:tc>
+      </w:tr>
+      <w:tr>
+        <w:trPr>
+          <w:cantSplit/>
+        </w:trPr>
+        <w:tc>
+          <w:tcPr>
+            <w:tcW w:type="dxa" w:w="1652"/>
+            <w:vAlign w:val="center"/>
+          </w:tcPr>
+          <w:p>
+            <w:pPr>
+              <w:widowControl/>
+              <w:spacing w:line="360" w:lineRule="auto" w:before="0" w:after="0"/>
+              <w:ind w:firstLine="0"/>
+              <w:jc w:val="center"/>
+            </w:pPr>
+            <w:r>
+              <w:rPr>
+                <w:rFonts w:ascii="宋体" w:hAnsi="宋体" w:eastAsia="宋体" w:cs="宋体"/>
+                <w:b w:val="0"/>
+                <w:color w:val="000000"/>
+                <w:sz w:val="24"/>
+              </w:rPr>
+              <w:t>融入现有流程</w:t>
+            </w:r>
+          </w:p>
+        </w:tc>
+        <w:tc>
+          <w:tcPr>
+            <w:tcW w:type="dxa" w:w="5607"/>
+            <w:vAlign w:val="center"/>
+          </w:tcPr>
+          <w:p>
+            <w:pPr>
+              <w:widowControl/>
+              <w:spacing w:line="360" w:lineRule="auto" w:before="0" w:after="0"/>
+              <w:ind w:firstLine="0"/>
+              <w:jc w:val="left"/>
+            </w:pPr>
+            <w:r>
+              <w:rPr>
+                <w:rFonts w:ascii="宋体" w:hAnsi="宋体" w:eastAsia="宋体" w:cs="宋体"/>
+                <w:b w:val="0"/>
+                <w:color w:val="000000"/>
+                <w:sz w:val="24"/>
+              </w:rPr>
+              <w:t>同一检查器作为CI合并门禁，退出码决定放行或拦下；SARIF 2.1.0可被支持该格式的代码扫描平台读取，JUnit可被常见CI平台展示</w:t>
+            </w:r>
+          </w:p>
+        </w:tc>
+        <w:tc>
+          <w:tcPr>
+            <w:tcW w:type="dxa" w:w="1359"/>
+            <w:vAlign w:val="center"/>
+          </w:tcPr>
+          <w:p>
+            <w:pPr>
+              <w:widowControl/>
+              <w:spacing w:line="360" w:lineRule="auto" w:before="0" w:after="0"/>
+              <w:ind w:firstLine="0"/>
+              <w:jc w:val="left"/>
+            </w:pPr>
+            <w:r>
+              <w:rPr>
+                <w:rFonts w:ascii="宋体" w:hAnsi="宋体" w:eastAsia="宋体" w:cs="宋体"/>
+                <w:b w:val="0"/>
+                <w:color w:val="000000"/>
+                <w:sz w:val="24"/>
+              </w:rPr>
+              <w:t>2.10节、3.6节</w:t>
+            </w:r>
+          </w:p>
+        </w:tc>
+      </w:tr>
+      <w:tr>
+        <w:trPr>
+          <w:cantSplit/>
+        </w:trPr>
+        <w:tc>
+          <w:tcPr>
+            <w:tcW w:type="dxa" w:w="1652"/>
+            <w:vAlign w:val="center"/>
+          </w:tcPr>
+          <w:p>
+            <w:pPr>
+              <w:widowControl/>
+              <w:spacing w:line="360" w:lineRule="auto" w:before="0" w:after="0"/>
+              <w:ind w:firstLine="0"/>
+              <w:jc w:val="left"/>
+            </w:pPr>
+            <w:r>
+              <w:rPr>
+                <w:rFonts w:ascii="宋体" w:hAnsi="宋体" w:eastAsia="宋体" w:cs="宋体"/>
+                <w:b w:val="0"/>
+                <w:color w:val="000000"/>
+                <w:sz w:val="24"/>
+              </w:rPr>
+              <w:t>管住以后的提交</w:t>
+            </w:r>
+          </w:p>
+        </w:tc>
+        <w:tc>
+          <w:tcPr>
+            <w:tcW w:type="dxa" w:w="5607"/>
+            <w:vAlign w:val="center"/>
+          </w:tcPr>
+          <w:p>
+            <w:pPr>
+              <w:widowControl/>
+              <w:spacing w:line="360" w:lineRule="auto" w:before="0" w:after="0"/>
+              <w:ind w:firstLine="0"/>
+              <w:jc w:val="left"/>
+            </w:pPr>
+            <w:r>
+              <w:rPr>
+                <w:rFonts w:ascii="宋体" w:hAnsi="宋体" w:eastAsia="宋体" w:cs="宋体"/>
+                <w:b w:val="0"/>
+                <w:color w:val="000000"/>
+                <w:sz w:val="24"/>
+              </w:rPr>
+              <w:t>一次接入后可导出pytest回归断言放进项目测试，修复版、重新引入缺陷版、无关修改版分别得到通过、不通过、通过，同类问题再次出现会被日常测试拦下</w:t>
+            </w:r>
+          </w:p>
+        </w:tc>
+        <w:tc>
+          <w:tcPr>
+            <w:tcW w:type="dxa" w:w="1359"/>
+            <w:vAlign w:val="center"/>
+          </w:tcPr>
+          <w:p>
+            <w:pPr>
+              <w:widowControl/>
+              <w:spacing w:line="360" w:lineRule="auto" w:before="0" w:after="0"/>
+              <w:ind w:firstLine="0"/>
+              <w:jc w:val="center"/>
+            </w:pPr>
+            <w:r>
+              <w:rPr>
+                <w:rFonts w:ascii="宋体" w:hAnsi="宋体" w:eastAsia="宋体" w:cs="宋体"/>
+                <w:b w:val="0"/>
+                <w:color w:val="000000"/>
+                <w:sz w:val="24"/>
+              </w:rPr>
+              <w:t>3.2节</w:t>
+            </w:r>
+          </w:p>
+        </w:tc>
+      </w:tr>
+      <w:tr>
+        <w:trPr>
+          <w:cantSplit/>
+        </w:trPr>
+        <w:tc>
+          <w:tcPr>
+            <w:tcW w:type="dxa" w:w="1652"/>
+            <w:vAlign w:val="center"/>
+          </w:tcPr>
+          <w:p>
+            <w:pPr>
+              <w:widowControl/>
+              <w:spacing w:line="360" w:lineRule="auto" w:before="0" w:after="0"/>
+              <w:ind w:firstLine="0"/>
+              <w:jc w:val="left"/>
+            </w:pPr>
+            <w:r>
+              <w:rPr>
+                <w:rFonts w:ascii="宋体" w:hAnsi="宋体" w:eastAsia="宋体" w:cs="宋体"/>
+                <w:b w:val="0"/>
+                <w:color w:val="000000"/>
+                <w:sz w:val="24"/>
+              </w:rPr>
+              <w:t>结论可交付、可复核</w:t>
+            </w:r>
+          </w:p>
+        </w:tc>
+        <w:tc>
+          <w:tcPr>
+            <w:tcW w:type="dxa" w:w="5607"/>
+            <w:vAlign w:val="center"/>
+          </w:tcPr>
+          <w:p>
+            <w:pPr>
+              <w:widowControl/>
+              <w:spacing w:line="360" w:lineRule="auto" w:before="0" w:after="0"/>
+              <w:ind w:firstLine="0"/>
+              <w:jc w:val="left"/>
+            </w:pPr>
+            <w:r>
+              <w:rPr>
+                <w:rFonts w:ascii="宋体" w:hAnsi="宋体" w:eastAsia="宋体" w:cs="宋体"/>
+                <w:b w:val="0"/>
+                <w:color w:val="000000"/>
+                <w:sz w:val="24"/>
+              </w:rPr>
+              <w:t>导出包含代码、配置、测试、组件、报告与清单，交付方、甲方或审计方都能在自己的目录重新执行完整检查</w:t>
+            </w:r>
+          </w:p>
+        </w:tc>
+        <w:tc>
+          <w:tcPr>
+            <w:tcW w:type="dxa" w:w="1359"/>
+            <w:vAlign w:val="center"/>
+          </w:tcPr>
+          <w:p>
+            <w:pPr>
+              <w:widowControl/>
+              <w:spacing w:line="360" w:lineRule="auto" w:before="0" w:after="0"/>
+              <w:ind w:firstLine="0"/>
+              <w:jc w:val="center"/>
+            </w:pPr>
+            <w:r>
+              <w:rPr>
+                <w:rFonts w:ascii="宋体" w:hAnsi="宋体" w:eastAsia="宋体" w:cs="宋体"/>
+                <w:b w:val="0"/>
+                <w:color w:val="000000"/>
+                <w:sz w:val="24"/>
+              </w:rPr>
+              <w:t>3.2节、3.4节</w:t>
+            </w:r>
+          </w:p>
+        </w:tc>
+      </w:tr>
+    </w:tbl>
+    <w:p>
+      <w:pPr>
+        <w:widowControl/>
+        <w:spacing w:line="192" w:lineRule="auto" w:before="0" w:after="0"/>
+        <w:ind w:firstLine="0"/>
+      </w:pPr>
+    </w:p>
+    <w:p>
+      <w:pPr>
+        <w:widowControl/>
+        <w:spacing w:line="360" w:lineRule="auto" w:before="0" w:after="60"/>
+        <w:ind w:firstLine="480"/>
+      </w:pPr>
+      <w:r>
+        <w:rPr>
+          <w:rFonts w:ascii="宋体" w:hAnsi="宋体" w:eastAsia="宋体" w:cs="宋体"/>
+          <w:b w:val="0"/>
+          <w:color w:val="000000"/>
+          <w:sz w:val="24"/>
+        </w:rPr>
+        <w:t>同时，它对数据合规友好：全部在本机运行，只使用随机生成的合成凭据和本地模拟服务，不需要把源代码、真实凭据或项目数据交给任何外部服务。对企业而言，这意味着可以先在一个敏感项目上试用，而不必经过数据出境或外部服务的审批。</w:t>
+      </w:r>
+    </w:p>
+    <w:p>
       <w:r>
         <w:br w:type="page"/>
       </w:r>
@@ -3996,7 +5277,7 @@
           <w:color w:val="000000"/>
           <w:sz w:val="24"/>
         </w:rPr>
-        <w:t>表4 设计目标、约束与实现指标</w:t>
+        <w:t>表6 设计目标、约束与实现指标</w:t>
       </w:r>
     </w:p>
     <w:tbl>
@@ -5381,7 +6662,7 @@
           <w:color w:val="000000"/>
           <w:sz w:val="24"/>
         </w:rPr>
-        <w:t>表5 行为级观测方式</w:t>
+        <w:t>表7 行为级观测方式</w:t>
       </w:r>
     </w:p>
     <w:tbl>
@@ -6469,7 +7750,7 @@
           <w:color w:val="000000"/>
           <w:sz w:val="24"/>
         </w:rPr>
-        <w:t>表6 防止“旧结论被新代码继承”的机制</w:t>
+        <w:t>表8 防止“旧结论被新代码继承”的机制</w:t>
       </w:r>
     </w:p>
     <w:tbl>
@@ -7344,7 +8625,7 @@
           <w:color w:val="000000"/>
           <w:sz w:val="24"/>
         </w:rPr>
-        <w:t>表7 主要功能模块</w:t>
+        <w:t>表9 主要功能模块</w:t>
       </w:r>
     </w:p>
     <w:tbl>
@@ -8168,7 +9449,7 @@
           <w:color w:val="000000"/>
           <w:sz w:val="24"/>
         </w:rPr>
-        <w:t>输出报告、SARIF与JUnit，并以退出码表达结论，流水线据此决定是否允许合并（表8）。我们在GitHub托管的Ubuntu 24.04虚拟机上实现了两种作业：Runner原生作业直接调用bubblewrap；容器作业在只读、无网络、能力全部丢弃、禁止提权并加载seccomp配置的Docker容器中运行检查（图13）。</w:t>
+        <w:t>输出报告、SARIF与JUnit，并以退出码表达结论，流水线据此决定是否允许合并（表10）。我们在GitHub托管的Ubuntu 24.04虚拟机上实现了两种作业：Runner原生作业直接调用bubblewrap；容器作业在只读、无网络、能力全部丢弃、禁止提权并加载seccomp配置的Docker容器中运行检查（图13）。</w:t>
       </w:r>
     </w:p>
     <w:p>
@@ -8186,7 +9467,7 @@
           <w:color w:val="000000"/>
           <w:sz w:val="24"/>
         </w:rPr>
-        <w:t>表8 检查退出码与流水线动作</w:t>
+        <w:t>表10 检查退出码与流水线动作</w:t>
       </w:r>
     </w:p>
     <w:tbl>
@@ -8700,7 +9981,7 @@
           <w:color w:val="000000"/>
           <w:sz w:val="24"/>
         </w:rPr>
-        <w:t>表9 作品自身的安全设计</w:t>
+        <w:t>表11 作品自身的安全设计</w:t>
       </w:r>
     </w:p>
     <w:tbl>
@@ -9298,7 +10579,7 @@
           <w:color w:val="000000"/>
           <w:sz w:val="24"/>
         </w:rPr>
-        <w:t>表10 测试环境</w:t>
+        <w:t>表12 测试环境</w:t>
       </w:r>
     </w:p>
     <w:tbl>
@@ -9652,7 +10933,7 @@
           <w:color w:val="000000"/>
           <w:sz w:val="24"/>
         </w:rPr>
-        <w:t>表11 测试矩阵</w:t>
+        <w:t>表13 测试矩阵</w:t>
       </w:r>
     </w:p>
     <w:tbl>
@@ -10632,7 +11913,7 @@
           <w:color w:val="000000"/>
           <w:sz w:val="24"/>
         </w:rPr>
-        <w:t xml:space="preserve"> bench-v1契约在运行前冻结，任何改动都必须升级版本。8个评测目标各植入1处缺陷并配参考修复（表12），其中5个缺陷业务测试发现不了。两个本地模型对每个目标各采样3次，第0轮提示中给出漏洞版源码、业务测试和检查结论（只有失败条件与计数，不含凭据和路径），第0轮未通过时进行1次反馈修订；</w:t>
+        <w:t xml:space="preserve"> bench-v1契约在运行前冻结，任何改动都必须升级版本。8个评测目标覆盖全部三类风险：4个凭据泄露、2个越界读取、2个未授权访问，各植入1处缺陷并配参考修复（表14），其中5个缺陷业务测试发现不了。两个本地模型对每个目标各采样3次，第0轮提示中给出漏洞版源码、业务测试和检查结论（只有失败条件与计数，不含凭据和路径），第0轮未通过时进行1次反馈修订；</w:t>
       </w:r>
       <w:r>
         <w:rPr>
@@ -10668,7 +11949,7 @@
           <w:color w:val="000000"/>
           <w:sz w:val="24"/>
         </w:rPr>
-        <w:t>表12 bench-v1评测目标</w:t>
+        <w:t>表14 bench-v1评测目标</w:t>
       </w:r>
     </w:p>
     <w:tbl>
@@ -10687,10 +11968,11 @@
         </w:tblBorders>
       </w:tblPr>
       <w:tblGrid>
-        <w:gridCol w:w="1750"/>
-        <w:gridCol w:w="3659"/>
-        <w:gridCol w:w="1920"/>
-        <w:gridCol w:w="1288"/>
+        <w:gridCol w:w="1533"/>
+        <w:gridCol w:w="1070"/>
+        <w:gridCol w:w="3204"/>
+        <w:gridCol w:w="1682"/>
+        <w:gridCol w:w="1128"/>
       </w:tblGrid>
       <w:tr>
         <w:trPr>
@@ -10699,7 +11981,7 @@
         </w:trPr>
         <w:tc>
           <w:tcPr>
-            <w:tcW w:type="dxa" w:w="1750"/>
+            <w:tcW w:type="dxa" w:w="1533"/>
             <w:vAlign w:val="center"/>
             <w:shd w:val="clear" w:fill="E7EEF0"/>
           </w:tcPr>
@@ -10723,7 +12005,7 @@
         </w:tc>
         <w:tc>
           <w:tcPr>
-            <w:tcW w:type="dxa" w:w="3659"/>
+            <w:tcW w:type="dxa" w:w="1070"/>
             <w:vAlign w:val="center"/>
             <w:shd w:val="clear" w:fill="E7EEF0"/>
           </w:tcPr>
@@ -10741,13 +12023,37 @@
                 <w:color w:val="000000"/>
                 <w:sz w:val="24"/>
               </w:rPr>
+              <w:t>风险类型</w:t>
+            </w:r>
+          </w:p>
+        </w:tc>
+        <w:tc>
+          <w:tcPr>
+            <w:tcW w:type="dxa" w:w="3204"/>
+            <w:vAlign w:val="center"/>
+            <w:shd w:val="clear" w:fill="E7EEF0"/>
+          </w:tcPr>
+          <w:p>
+            <w:pPr>
+              <w:widowControl/>
+              <w:spacing w:line="360" w:lineRule="auto" w:before="0" w:after="0"/>
+              <w:ind w:firstLine="0"/>
+              <w:jc w:val="center"/>
+            </w:pPr>
+            <w:r>
+              <w:rPr>
+                <w:rFonts w:ascii="宋体" w:hAnsi="宋体" w:eastAsia="宋体" w:cs="宋体"/>
+                <w:b/>
+                <w:color w:val="000000"/>
+                <w:sz w:val="24"/>
+              </w:rPr>
               <w:t>缺陷</w:t>
             </w:r>
           </w:p>
         </w:tc>
         <w:tc>
           <w:tcPr>
-            <w:tcW w:type="dxa" w:w="1920"/>
+            <w:tcW w:type="dxa" w:w="1682"/>
             <w:vAlign w:val="center"/>
             <w:shd w:val="clear" w:fill="E7EEF0"/>
           </w:tcPr>
@@ -10771,7 +12077,7 @@
         </w:tc>
         <w:tc>
           <w:tcPr>
-            <w:tcW w:type="dxa" w:w="1288"/>
+            <w:tcW w:type="dxa" w:w="1128"/>
             <w:vAlign w:val="center"/>
             <w:shd w:val="clear" w:fill="E7EEF0"/>
           </w:tcPr>
@@ -10800,7 +12106,7 @@
         </w:trPr>
         <w:tc>
           <w:tcPr>
-            <w:tcW w:type="dxa" w:w="1750"/>
+            <w:tcW w:type="dxa" w:w="1533"/>
             <w:vAlign w:val="center"/>
           </w:tcPr>
           <w:p>
@@ -10823,7 +12129,30 @@
         </w:tc>
         <w:tc>
           <w:tcPr>
-            <w:tcW w:type="dxa" w:w="3659"/>
+            <w:tcW w:type="dxa" w:w="1070"/>
+            <w:vAlign w:val="center"/>
+          </w:tcPr>
+          <w:p>
+            <w:pPr>
+              <w:widowControl/>
+              <w:spacing w:line="360" w:lineRule="auto" w:before="0" w:after="0"/>
+              <w:ind w:firstLine="0"/>
+              <w:jc w:val="center"/>
+            </w:pPr>
+            <w:r>
+              <w:rPr>
+                <w:rFonts w:ascii="宋体" w:hAnsi="宋体" w:eastAsia="宋体" w:cs="宋体"/>
+                <w:b w:val="0"/>
+                <w:color w:val="000000"/>
+                <w:sz w:val="24"/>
+              </w:rPr>
+              <w:t>不泄密</w:t>
+            </w:r>
+          </w:p>
+        </w:tc>
+        <w:tc>
+          <w:tcPr>
+            <w:tcW w:type="dxa" w:w="3204"/>
             <w:vAlign w:val="center"/>
           </w:tcPr>
           <w:p>
@@ -10846,7 +12175,7 @@
         </w:tc>
         <w:tc>
           <w:tcPr>
-            <w:tcW w:type="dxa" w:w="1920"/>
+            <w:tcW w:type="dxa" w:w="1682"/>
             <w:vAlign w:val="center"/>
           </w:tcPr>
           <w:p>
@@ -10869,7 +12198,7 @@
         </w:tc>
         <w:tc>
           <w:tcPr>
-            <w:tcW w:type="dxa" w:w="1288"/>
+            <w:tcW w:type="dxa" w:w="1128"/>
             <w:vAlign w:val="center"/>
           </w:tcPr>
           <w:p>
@@ -10897,7 +12226,7 @@
         </w:trPr>
         <w:tc>
           <w:tcPr>
-            <w:tcW w:type="dxa" w:w="1750"/>
+            <w:tcW w:type="dxa" w:w="1533"/>
             <w:vAlign w:val="center"/>
           </w:tcPr>
           <w:p>
@@ -10920,7 +12249,30 @@
         </w:tc>
         <w:tc>
           <w:tcPr>
-            <w:tcW w:type="dxa" w:w="3659"/>
+            <w:tcW w:type="dxa" w:w="1070"/>
+            <w:vAlign w:val="center"/>
+          </w:tcPr>
+          <w:p>
+            <w:pPr>
+              <w:widowControl/>
+              <w:spacing w:line="360" w:lineRule="auto" w:before="0" w:after="0"/>
+              <w:ind w:firstLine="0"/>
+              <w:jc w:val="center"/>
+            </w:pPr>
+            <w:r>
+              <w:rPr>
+                <w:rFonts w:ascii="宋体" w:hAnsi="宋体" w:eastAsia="宋体" w:cs="宋体"/>
+                <w:b w:val="0"/>
+                <w:color w:val="000000"/>
+                <w:sz w:val="24"/>
+              </w:rPr>
+              <w:t>不泄密</w:t>
+            </w:r>
+          </w:p>
+        </w:tc>
+        <w:tc>
+          <w:tcPr>
+            <w:tcW w:type="dxa" w:w="3204"/>
             <w:vAlign w:val="center"/>
           </w:tcPr>
           <w:p>
@@ -10943,7 +12295,7 @@
         </w:tc>
         <w:tc>
           <w:tcPr>
-            <w:tcW w:type="dxa" w:w="1920"/>
+            <w:tcW w:type="dxa" w:w="1682"/>
             <w:vAlign w:val="center"/>
           </w:tcPr>
           <w:p>
@@ -10966,7 +12318,7 @@
         </w:tc>
         <w:tc>
           <w:tcPr>
-            <w:tcW w:type="dxa" w:w="1288"/>
+            <w:tcW w:type="dxa" w:w="1128"/>
             <w:vAlign w:val="center"/>
           </w:tcPr>
           <w:p>
@@ -10994,7 +12346,7 @@
         </w:trPr>
         <w:tc>
           <w:tcPr>
-            <w:tcW w:type="dxa" w:w="1750"/>
+            <w:tcW w:type="dxa" w:w="1533"/>
             <w:vAlign w:val="center"/>
           </w:tcPr>
           <w:p>
@@ -11017,7 +12369,30 @@
         </w:tc>
         <w:tc>
           <w:tcPr>
-            <w:tcW w:type="dxa" w:w="3659"/>
+            <w:tcW w:type="dxa" w:w="1070"/>
+            <w:vAlign w:val="center"/>
+          </w:tcPr>
+          <w:p>
+            <w:pPr>
+              <w:widowControl/>
+              <w:spacing w:line="360" w:lineRule="auto" w:before="0" w:after="0"/>
+              <w:ind w:firstLine="0"/>
+              <w:jc w:val="center"/>
+            </w:pPr>
+            <w:r>
+              <w:rPr>
+                <w:rFonts w:ascii="宋体" w:hAnsi="宋体" w:eastAsia="宋体" w:cs="宋体"/>
+                <w:b w:val="0"/>
+                <w:color w:val="000000"/>
+                <w:sz w:val="24"/>
+              </w:rPr>
+              <w:t>不泄密</w:t>
+            </w:r>
+          </w:p>
+        </w:tc>
+        <w:tc>
+          <w:tcPr>
+            <w:tcW w:type="dxa" w:w="3204"/>
             <w:vAlign w:val="center"/>
           </w:tcPr>
           <w:p>
@@ -11040,7 +12415,7 @@
         </w:tc>
         <w:tc>
           <w:tcPr>
-            <w:tcW w:type="dxa" w:w="1920"/>
+            <w:tcW w:type="dxa" w:w="1682"/>
             <w:vAlign w:val="center"/>
           </w:tcPr>
           <w:p>
@@ -11063,7 +12438,7 @@
         </w:tc>
         <w:tc>
           <w:tcPr>
-            <w:tcW w:type="dxa" w:w="1288"/>
+            <w:tcW w:type="dxa" w:w="1128"/>
             <w:vAlign w:val="center"/>
           </w:tcPr>
           <w:p>
@@ -11091,7 +12466,7 @@
         </w:trPr>
         <w:tc>
           <w:tcPr>
-            <w:tcW w:type="dxa" w:w="1750"/>
+            <w:tcW w:type="dxa" w:w="1533"/>
             <w:vAlign w:val="center"/>
           </w:tcPr>
           <w:p>
@@ -11114,7 +12489,30 @@
         </w:tc>
         <w:tc>
           <w:tcPr>
-            <w:tcW w:type="dxa" w:w="3659"/>
+            <w:tcW w:type="dxa" w:w="1070"/>
+            <w:vAlign w:val="center"/>
+          </w:tcPr>
+          <w:p>
+            <w:pPr>
+              <w:widowControl/>
+              <w:spacing w:line="360" w:lineRule="auto" w:before="0" w:after="0"/>
+              <w:ind w:firstLine="0"/>
+              <w:jc w:val="center"/>
+            </w:pPr>
+            <w:r>
+              <w:rPr>
+                <w:rFonts w:ascii="宋体" w:hAnsi="宋体" w:eastAsia="宋体" w:cs="宋体"/>
+                <w:b w:val="0"/>
+                <w:color w:val="000000"/>
+                <w:sz w:val="24"/>
+              </w:rPr>
+              <w:t>不泄密</w:t>
+            </w:r>
+          </w:p>
+        </w:tc>
+        <w:tc>
+          <w:tcPr>
+            <w:tcW w:type="dxa" w:w="3204"/>
             <w:vAlign w:val="center"/>
           </w:tcPr>
           <w:p>
@@ -11137,7 +12535,7 @@
         </w:tc>
         <w:tc>
           <w:tcPr>
-            <w:tcW w:type="dxa" w:w="1920"/>
+            <w:tcW w:type="dxa" w:w="1682"/>
             <w:vAlign w:val="center"/>
           </w:tcPr>
           <w:p>
@@ -11160,7 +12558,7 @@
         </w:tc>
         <w:tc>
           <w:tcPr>
-            <w:tcW w:type="dxa" w:w="1288"/>
+            <w:tcW w:type="dxa" w:w="1128"/>
             <w:vAlign w:val="center"/>
           </w:tcPr>
           <w:p>
@@ -11188,7 +12586,7 @@
         </w:trPr>
         <w:tc>
           <w:tcPr>
-            <w:tcW w:type="dxa" w:w="1750"/>
+            <w:tcW w:type="dxa" w:w="1533"/>
             <w:vAlign w:val="center"/>
           </w:tcPr>
           <w:p>
@@ -11211,7 +12609,30 @@
         </w:tc>
         <w:tc>
           <w:tcPr>
-            <w:tcW w:type="dxa" w:w="3659"/>
+            <w:tcW w:type="dxa" w:w="1070"/>
+            <w:vAlign w:val="center"/>
+          </w:tcPr>
+          <w:p>
+            <w:pPr>
+              <w:widowControl/>
+              <w:spacing w:line="360" w:lineRule="auto" w:before="0" w:after="0"/>
+              <w:ind w:firstLine="0"/>
+              <w:jc w:val="center"/>
+            </w:pPr>
+            <w:r>
+              <w:rPr>
+                <w:rFonts w:ascii="宋体" w:hAnsi="宋体" w:eastAsia="宋体" w:cs="宋体"/>
+                <w:b w:val="0"/>
+                <w:color w:val="000000"/>
+                <w:sz w:val="24"/>
+              </w:rPr>
+              <w:t>不乱读</w:t>
+            </w:r>
+          </w:p>
+        </w:tc>
+        <w:tc>
+          <w:tcPr>
+            <w:tcW w:type="dxa" w:w="3204"/>
             <w:vAlign w:val="center"/>
           </w:tcPr>
           <w:p>
@@ -11234,7 +12655,7 @@
         </w:tc>
         <w:tc>
           <w:tcPr>
-            <w:tcW w:type="dxa" w:w="1920"/>
+            <w:tcW w:type="dxa" w:w="1682"/>
             <w:vAlign w:val="center"/>
           </w:tcPr>
           <w:p>
@@ -11257,7 +12678,7 @@
         </w:tc>
         <w:tc>
           <w:tcPr>
-            <w:tcW w:type="dxa" w:w="1288"/>
+            <w:tcW w:type="dxa" w:w="1128"/>
             <w:vAlign w:val="center"/>
           </w:tcPr>
           <w:p>
@@ -11285,7 +12706,7 @@
         </w:trPr>
         <w:tc>
           <w:tcPr>
-            <w:tcW w:type="dxa" w:w="1750"/>
+            <w:tcW w:type="dxa" w:w="1533"/>
             <w:vAlign w:val="center"/>
           </w:tcPr>
           <w:p>
@@ -11308,7 +12729,30 @@
         </w:tc>
         <w:tc>
           <w:tcPr>
-            <w:tcW w:type="dxa" w:w="3659"/>
+            <w:tcW w:type="dxa" w:w="1070"/>
+            <w:vAlign w:val="center"/>
+          </w:tcPr>
+          <w:p>
+            <w:pPr>
+              <w:widowControl/>
+              <w:spacing w:line="360" w:lineRule="auto" w:before="0" w:after="0"/>
+              <w:ind w:firstLine="0"/>
+              <w:jc w:val="center"/>
+            </w:pPr>
+            <w:r>
+              <w:rPr>
+                <w:rFonts w:ascii="宋体" w:hAnsi="宋体" w:eastAsia="宋体" w:cs="宋体"/>
+                <w:b w:val="0"/>
+                <w:color w:val="000000"/>
+                <w:sz w:val="24"/>
+              </w:rPr>
+              <w:t>不乱读</w:t>
+            </w:r>
+          </w:p>
+        </w:tc>
+        <w:tc>
+          <w:tcPr>
+            <w:tcW w:type="dxa" w:w="3204"/>
             <w:vAlign w:val="center"/>
           </w:tcPr>
           <w:p>
@@ -11331,7 +12775,7 @@
         </w:tc>
         <w:tc>
           <w:tcPr>
-            <w:tcW w:type="dxa" w:w="1920"/>
+            <w:tcW w:type="dxa" w:w="1682"/>
             <w:vAlign w:val="center"/>
           </w:tcPr>
           <w:p>
@@ -11354,7 +12798,7 @@
         </w:tc>
         <w:tc>
           <w:tcPr>
-            <w:tcW w:type="dxa" w:w="1288"/>
+            <w:tcW w:type="dxa" w:w="1128"/>
             <w:vAlign w:val="center"/>
           </w:tcPr>
           <w:p>
@@ -11382,7 +12826,7 @@
         </w:trPr>
         <w:tc>
           <w:tcPr>
-            <w:tcW w:type="dxa" w:w="1750"/>
+            <w:tcW w:type="dxa" w:w="1533"/>
             <w:vAlign w:val="center"/>
           </w:tcPr>
           <w:p>
@@ -11405,7 +12849,30 @@
         </w:tc>
         <w:tc>
           <w:tcPr>
-            <w:tcW w:type="dxa" w:w="3659"/>
+            <w:tcW w:type="dxa" w:w="1070"/>
+            <w:vAlign w:val="center"/>
+          </w:tcPr>
+          <w:p>
+            <w:pPr>
+              <w:widowControl/>
+              <w:spacing w:line="360" w:lineRule="auto" w:before="0" w:after="0"/>
+              <w:ind w:firstLine="0"/>
+              <w:jc w:val="center"/>
+            </w:pPr>
+            <w:r>
+              <w:rPr>
+                <w:rFonts w:ascii="宋体" w:hAnsi="宋体" w:eastAsia="宋体" w:cs="宋体"/>
+                <w:b w:val="0"/>
+                <w:color w:val="000000"/>
+                <w:sz w:val="24"/>
+              </w:rPr>
+              <w:t>不乱连</w:t>
+            </w:r>
+          </w:p>
+        </w:tc>
+        <w:tc>
+          <w:tcPr>
+            <w:tcW w:type="dxa" w:w="3204"/>
             <w:vAlign w:val="center"/>
           </w:tcPr>
           <w:p>
@@ -11428,7 +12895,7 @@
         </w:tc>
         <w:tc>
           <w:tcPr>
-            <w:tcW w:type="dxa" w:w="1920"/>
+            <w:tcW w:type="dxa" w:w="1682"/>
             <w:vAlign w:val="center"/>
           </w:tcPr>
           <w:p>
@@ -11451,7 +12918,7 @@
         </w:tc>
         <w:tc>
           <w:tcPr>
-            <w:tcW w:type="dxa" w:w="1288"/>
+            <w:tcW w:type="dxa" w:w="1128"/>
             <w:vAlign w:val="center"/>
           </w:tcPr>
           <w:p>
@@ -11479,7 +12946,7 @@
         </w:trPr>
         <w:tc>
           <w:tcPr>
-            <w:tcW w:type="dxa" w:w="1750"/>
+            <w:tcW w:type="dxa" w:w="1533"/>
             <w:vAlign w:val="center"/>
           </w:tcPr>
           <w:p>
@@ -11502,7 +12969,30 @@
         </w:tc>
         <w:tc>
           <w:tcPr>
-            <w:tcW w:type="dxa" w:w="3659"/>
+            <w:tcW w:type="dxa" w:w="1070"/>
+            <w:vAlign w:val="center"/>
+          </w:tcPr>
+          <w:p>
+            <w:pPr>
+              <w:widowControl/>
+              <w:spacing w:line="360" w:lineRule="auto" w:before="0" w:after="0"/>
+              <w:ind w:firstLine="0"/>
+              <w:jc w:val="center"/>
+            </w:pPr>
+            <w:r>
+              <w:rPr>
+                <w:rFonts w:ascii="宋体" w:hAnsi="宋体" w:eastAsia="宋体" w:cs="宋体"/>
+                <w:b w:val="0"/>
+                <w:color w:val="000000"/>
+                <w:sz w:val="24"/>
+              </w:rPr>
+              <w:t>不乱连</w:t>
+            </w:r>
+          </w:p>
+        </w:tc>
+        <w:tc>
+          <w:tcPr>
+            <w:tcW w:type="dxa" w:w="3204"/>
             <w:vAlign w:val="center"/>
           </w:tcPr>
           <w:p>
@@ -11525,7 +13015,7 @@
         </w:tc>
         <w:tc>
           <w:tcPr>
-            <w:tcW w:type="dxa" w:w="1920"/>
+            <w:tcW w:type="dxa" w:w="1682"/>
             <w:vAlign w:val="center"/>
           </w:tcPr>
           <w:p>
@@ -11548,7 +13038,7 @@
         </w:tc>
         <w:tc>
           <w:tcPr>
-            <w:tcW w:type="dxa" w:w="1288"/>
+            <w:tcW w:type="dxa" w:w="1128"/>
             <w:vAlign w:val="center"/>
           </w:tcPr>
           <w:p>
@@ -11831,7 +13321,25 @@
           <w:color w:val="000000"/>
           <w:sz w:val="24"/>
         </w:rPr>
-        <w:t xml:space="preserve"> 不合格的AI补丁往往在“源码看起来没问题”的地方出错：凭据来自环境变量，泄露发生在跳转、日志和返回值里。这些问题只有运行起来才能看到，而且需要独立的观察者记录“禁止服务是否收到请求、凭据出现在哪个通道”这类事实。样本是开发可见的合成小工具，不代表真实项目分布，不同覆盖范围的方法也不宜直接排名；我们把它作为“哪些问题只有运行证据才能发现”的对照，而不是模型修复能力的结论。</w:t>
+        <w:t xml:space="preserve"> 不合格的修改往往在“源码看起来没问题”的地方出错：凭据来自环境变量，泄露发生在日志、返回值和异常里；路径校验用字符串前缀判断，被</w:t>
+      </w:r>
+      <w:r>
+        <w:rPr>
+          <w:rFonts w:ascii="宋体" w:hAnsi="宋体" w:eastAsia="宋体" w:cs="宋体"/>
+          <w:b w:val="0"/>
+          <w:color w:val="000000"/>
+          <w:sz w:val="24"/>
+        </w:rPr>
+        <w:t>../</w:t>
+      </w:r>
+      <w:r>
+        <w:rPr>
+          <w:rFonts w:ascii="宋体" w:hAnsi="宋体" w:eastAsia="宋体" w:cs="宋体"/>
+          <w:b w:val="0"/>
+          <w:color w:val="000000"/>
+          <w:sz w:val="24"/>
+        </w:rPr>
+        <w:t>和符号链接绕过；请求库默认跟随跳转，把认证头带给了别的服务。三类问题都只有运行起来才能看到，而且需要独立的观察者记录“读了哪个文件、禁止服务是否收到请求、凭据出现在哪个通道”这类事实。样本是开发可见的合成小工具，不代表真实项目分布，不同覆盖范围的方法也不宜直接排名；我们把它作为“哪些问题只有运行证据才能发现”的对照，而不是模型修复能力的结论。</w:t>
       </w:r>
     </w:p>
     <w:p>
@@ -12191,7 +13699,7 @@
           <w:color w:val="000000"/>
           <w:sz w:val="24"/>
         </w:rPr>
-        <w:t>表13 作品自身测试结果</w:t>
+        <w:t>表15 作品自身测试结果</w:t>
       </w:r>
     </w:p>
     <w:tbl>
@@ -12777,7 +14285,7 @@
           <w:color w:val="000000"/>
           <w:sz w:val="24"/>
         </w:rPr>
-        <w:t>表14 性能与资源开销</w:t>
+        <w:t>表16 性能与资源开销</w:t>
       </w:r>
     </w:p>
     <w:tbl>
@@ -13173,16 +14681,16 @@
           <w:color w:val="000000"/>
           <w:sz w:val="24"/>
         </w:rPr>
-        <w:t>只有运行证据能发现的问题真实存在。</w:t>
-      </w:r>
-      <w:r>
-        <w:rPr>
-          <w:rFonts w:ascii="宋体" w:hAnsi="宋体" w:eastAsia="宋体" w:cs="宋体"/>
-          <w:b w:val="0"/>
-          <w:color w:val="000000"/>
-          <w:sz w:val="24"/>
-        </w:rPr>
-        <w:t xml:space="preserve"> 6个跳转泄露补丁、python-dotenv重新引入的缺陷都让业务测试全部通过，静态规则和文本裁判也没有拦住。</w:t>
+        <w:t>三类风险都有真实拦截。</w:t>
+      </w:r>
+      <w:r>
+        <w:rPr>
+          <w:rFonts w:ascii="宋体" w:hAnsi="宋体" w:eastAsia="宋体" w:cs="宋体"/>
+          <w:b w:val="0"/>
+          <w:color w:val="000000"/>
+          <w:sz w:val="24"/>
+        </w:rPr>
+        <w:t xml:space="preserve"> 乱连：同批6个AI补丁把凭据随跳转带给未授权服务，CI实验中含缺陷的拉取请求同样被拦下；乱读：python-dotenv重新引入的越界缺陷、B05与B06漏洞版；泄密：资料助手原问题的3个泄露通道、21个历史AI补丁中实际泄露凭据的10个。其中多项在业务测试全部通过时依然存在，静态规则和文本裁判也未能全部发现。</w:t>
       </w:r>
     </w:p>
     <w:p>
@@ -13288,6 +14796,41 @@
           <w:sz w:val="24"/>
         </w:rPr>
         <w:t xml:space="preserve"> 从浏览器接入、检查、修订、采纳到新目录复检和CI门禁都在真实环境中走通。</w:t>
+      </w:r>
+    </w:p>
+    <w:p>
+      <w:pPr>
+        <w:widowControl/>
+        <w:spacing w:line="360" w:lineRule="auto" w:before="0" w:after="60"/>
+        <w:ind w:left="480" w:hanging="360"/>
+        <w:jc w:val="left"/>
+      </w:pPr>
+      <w:r>
+        <w:rPr>
+          <w:rFonts w:ascii="宋体" w:hAnsi="宋体" w:eastAsia="宋体" w:cs="宋体"/>
+          <w:b w:val="0"/>
+          <w:color w:val="000000"/>
+          <w:sz w:val="24"/>
+        </w:rPr>
+        <w:t xml:space="preserve">5. </w:t>
+      </w:r>
+      <w:r>
+        <w:rPr>
+          <w:rFonts w:ascii="宋体" w:hAnsi="宋体" w:eastAsia="宋体" w:cs="宋体"/>
+          <w:b/>
+          <w:color w:val="000000"/>
+          <w:sz w:val="24"/>
+        </w:rPr>
+        <w:t>能直接用于日常开发。</w:t>
+      </w:r>
+      <w:r>
+        <w:rPr>
+          <w:rFonts w:ascii="宋体" w:hAnsi="宋体" w:eastAsia="宋体" w:cs="宋体"/>
+          <w:b w:val="0"/>
+          <w:color w:val="000000"/>
+          <w:sz w:val="24"/>
+        </w:rPr>
+        <w:t xml:space="preserve"> 浏览器接入、秒级检查、CI门禁、回归断言导出和新目录复检都已在真实环境运行，不依赖GPU、付费API或外部服务。</w:t>
       </w:r>
     </w:p>
     <w:p>
@@ -13371,7 +14914,7 @@
           <w:color w:val="000000"/>
           <w:sz w:val="24"/>
         </w:rPr>
-        <w:t>表15 与现有方案的能力对比</w:t>
+        <w:t>表17 与现有方案的能力对比</w:t>
       </w:r>
     </w:p>
     <w:tbl>
@@ -13713,7 +15256,7 @@
                 <w:color w:val="000000"/>
                 <w:sz w:val="24"/>
               </w:rPr>
-              <w:t>发现越界读取与跟随跳转</w:t>
+              <w:t>发现越界读取与未授权访问（含跟随跳转）</w:t>
             </w:r>
           </w:p>
         </w:tc>
@@ -14923,7 +16466,7 @@
           <w:color w:val="000000"/>
           <w:sz w:val="24"/>
         </w:rPr>
-        <w:t>密证CredProof回答了AI编程时代的一个关键问题：AI说“已修复”，凭什么采纳。它以隔离环境中的运行证据替代AI自述，以双向证据判定识别表面修复和假修复，以三状态分离和对象绑定保证结论可信、可交付，以五个问题把严格的判定翻译成负责人可以决策的语言，并通过同一检查器贯通网页、命令行和CI。在真实案例闭环、88条冻结对照记录、开源组件python-dotenv、本地模型候选和GitHub Actions门禁上的测试表明，CredProof能够发现业务测试、静态规则和大模型裁判漏掉的问题，合格修改不被误拦，检查速度足以作为日常开发门禁。</w:t>
+        <w:t>密证CredProof回答了AI编程时代的一个关键问题：AI说“已修复”，凭什么采纳。它以隔离环境中的运行证据替代AI自述，一次检查同时守住不泄密、不乱读、不乱连三条底线，以双向证据判定识别表面修复和假修复，以三状态分离和对象绑定保证结论可信、可交付，以五个问题把严格的判定翻译成负责人可以决策的语言，并通过同一检查器贯通网页、命令行和CI。在真实案例闭环、88条冻结对照记录、开源组件python-dotenv、本地模型候选和GitHub Actions门禁上的测试表明，CredProof能够发现业务测试、静态规则和大模型裁判漏掉的问题，合格修改不被误拦。它的实用性同样经过了验证：浏览器上传项目即可接入，单次检查约1.6秒，本机运行、不需要GPU和付费API，可以直接作为每次提交的合并门禁，并把回归断言留在项目里持续把关。</w:t>
       </w:r>
     </w:p>
     <w:p>

</xml_diff>

<commit_message>
docs(report): neutral hardware wording and refreshed revision screenshot
Co-Authored-By: Claude Opus 5.5 <noreply@anthropic.com>
Claude-Session: https://claude.ai/code/session_01QLQFrwW1hV7hrYF9ugkKnx
</commit_message>
<xml_diff>
--- a/docs/report-v3/out/credproof-report.docx
+++ b/docs/report-v3/out/credproof-report.docx
@@ -8476,7 +8476,7 @@
       <w:r>
         <w:drawing>
           <wp:inline xmlns:a="http://schemas.openxmlformats.org/drawingml/2006/main" xmlns:pic="http://schemas.openxmlformats.org/drawingml/2006/picture">
-            <wp:extent cx="4500000" cy="4730960"/>
+            <wp:extent cx="4500000" cy="5069950"/>
             <wp:docPr id="11" name="Picture 11"/>
             <wp:cNvGraphicFramePr>
               <a:graphicFrameLocks noChangeAspect="1"/>
@@ -8497,7 +8497,7 @@
                   <pic:spPr>
                     <a:xfrm>
                       <a:off x="0" y="0"/>
-                      <a:ext cx="4500000" cy="4730960"/>
+                      <a:ext cx="4500000" cy="5069950"/>
                     </a:xfrm>
                     <a:prstGeom prst="rect"/>
                   </pic:spPr>
@@ -10598,8 +10598,8 @@
         </w:tblBorders>
       </w:tblPr>
       <w:tblGrid>
-        <w:gridCol w:w="1971"/>
-        <w:gridCol w:w="6646"/>
+        <w:gridCol w:w="1961"/>
+        <w:gridCol w:w="6656"/>
       </w:tblGrid>
       <w:tr>
         <w:trPr>
@@ -10608,7 +10608,7 @@
         </w:trPr>
         <w:tc>
           <w:tcPr>
-            <w:tcW w:type="dxa" w:w="1971"/>
+            <w:tcW w:type="dxa" w:w="1961"/>
             <w:vAlign w:val="center"/>
             <w:shd w:val="clear" w:fill="E7EEF0"/>
           </w:tcPr>
@@ -10632,7 +10632,7 @@
         </w:tc>
         <w:tc>
           <w:tcPr>
-            <w:tcW w:type="dxa" w:w="6646"/>
+            <w:tcW w:type="dxa" w:w="6656"/>
             <w:vAlign w:val="center"/>
             <w:shd w:val="clear" w:fill="E7EEF0"/>
           </w:tcPr>
@@ -10661,7 +10661,7 @@
         </w:trPr>
         <w:tc>
           <w:tcPr>
-            <w:tcW w:type="dxa" w:w="1971"/>
+            <w:tcW w:type="dxa" w:w="1961"/>
             <w:vAlign w:val="center"/>
           </w:tcPr>
           <w:p>
@@ -10684,24 +10684,24 @@
         </w:tc>
         <w:tc>
           <w:tcPr>
-            <w:tcW w:type="dxa" w:w="6646"/>
-            <w:vAlign w:val="center"/>
-          </w:tcPr>
-          <w:p>
-            <w:pPr>
-              <w:widowControl/>
-              <w:spacing w:line="360" w:lineRule="auto" w:before="0" w:after="0"/>
-              <w:ind w:firstLine="0"/>
-              <w:jc w:val="left"/>
-            </w:pPr>
-            <w:r>
-              <w:rPr>
-                <w:rFonts w:ascii="宋体" w:hAnsi="宋体" w:eastAsia="宋体" w:cs="宋体"/>
-                <w:b w:val="0"/>
-                <w:color w:val="000000"/>
-                <w:sz w:val="24"/>
-              </w:rPr>
-              <w:t>Windows 11专业版；Intel Core i9-14900；64 GB内存；RTX 5090（32 GB显存）</w:t>
+            <w:tcW w:type="dxa" w:w="6656"/>
+            <w:vAlign w:val="center"/>
+          </w:tcPr>
+          <w:p>
+            <w:pPr>
+              <w:widowControl/>
+              <w:spacing w:line="360" w:lineRule="auto" w:before="0" w:after="0"/>
+              <w:ind w:firstLine="0"/>
+              <w:jc w:val="left"/>
+            </w:pPr>
+            <w:r>
+              <w:rPr>
+                <w:rFonts w:ascii="宋体" w:hAnsi="宋体" w:eastAsia="宋体" w:cs="宋体"/>
+                <w:b w:val="0"/>
+                <w:color w:val="000000"/>
+                <w:sz w:val="24"/>
+              </w:rPr>
+              <w:t>Windows 11专业版；Intel Core i9-14900；64 GB内存；NVIDIA GeForce RTX 50系列显卡（32 GB显存）</w:t>
             </w:r>
           </w:p>
         </w:tc>
@@ -10712,7 +10712,7 @@
         </w:trPr>
         <w:tc>
           <w:tcPr>
-            <w:tcW w:type="dxa" w:w="1971"/>
+            <w:tcW w:type="dxa" w:w="1961"/>
             <w:vAlign w:val="center"/>
           </w:tcPr>
           <w:p>
@@ -10735,7 +10735,7 @@
         </w:tc>
         <w:tc>
           <w:tcPr>
-            <w:tcW w:type="dxa" w:w="6646"/>
+            <w:tcW w:type="dxa" w:w="6656"/>
             <w:vAlign w:val="center"/>
           </w:tcPr>
           <w:p>
@@ -10763,7 +10763,7 @@
         </w:trPr>
         <w:tc>
           <w:tcPr>
-            <w:tcW w:type="dxa" w:w="1971"/>
+            <w:tcW w:type="dxa" w:w="1961"/>
             <w:vAlign w:val="center"/>
           </w:tcPr>
           <w:p>
@@ -10786,7 +10786,7 @@
         </w:tc>
         <w:tc>
           <w:tcPr>
-            <w:tcW w:type="dxa" w:w="6646"/>
+            <w:tcW w:type="dxa" w:w="6656"/>
             <w:vAlign w:val="center"/>
           </w:tcPr>
           <w:p>
@@ -10814,7 +10814,7 @@
         </w:trPr>
         <w:tc>
           <w:tcPr>
-            <w:tcW w:type="dxa" w:w="1971"/>
+            <w:tcW w:type="dxa" w:w="1961"/>
             <w:vAlign w:val="center"/>
           </w:tcPr>
           <w:p>
@@ -10837,7 +10837,7 @@
         </w:tc>
         <w:tc>
           <w:tcPr>
-            <w:tcW w:type="dxa" w:w="6646"/>
+            <w:tcW w:type="dxa" w:w="6656"/>
             <w:vAlign w:val="center"/>
           </w:tcPr>
           <w:p>
@@ -10865,7 +10865,7 @@
         </w:trPr>
         <w:tc>
           <w:tcPr>
-            <w:tcW w:type="dxa" w:w="1971"/>
+            <w:tcW w:type="dxa" w:w="1961"/>
             <w:vAlign w:val="center"/>
           </w:tcPr>
           <w:p>
@@ -10888,7 +10888,7 @@
         </w:tc>
         <w:tc>
           <w:tcPr>
-            <w:tcW w:type="dxa" w:w="6646"/>
+            <w:tcW w:type="dxa" w:w="6656"/>
             <w:vAlign w:val="center"/>
           </w:tcPr>
           <w:p>
@@ -11845,7 +11845,7 @@
           <w:color w:val="000000"/>
           <w:sz w:val="24"/>
         </w:rPr>
-        <w:t xml:space="preserve"> 开发者在AI编码助手辅助下改用受控访问组件，保留真实文件读取、服务认证和异常约定。4项必要测试全部执行并通过，14项条件全部满足；读取允许资料5次，允许服务收到4次带凭据请求，禁止服务0次，跳转场景按约定抛出HTTPError。此时状态为“通过、待人工决定、未应用”。</w:t>
+        <w:t xml:space="preserve"> 开发者改用受控访问组件，保留真实文件读取、服务认证和异常约定。4项必要测试全部执行并通过，14项条件全部满足；读取允许资料5次，允许服务收到4次带凭据请求，禁止服务0次，跳转场景按约定抛出HTTPError。此时状态为“通过、待人工决定、未应用”。</w:t>
       </w:r>
     </w:p>
     <w:p>

</xml_diff>

<commit_message>
docs(report): rebuild after declaration change
Co-Authored-By: Claude Opus 5.5 <noreply@anthropic.com>
Claude-Session: https://claude.ai/code/session_01QLQFrwW1hV7hrYF9ugkKnx
</commit_message>
<xml_diff>
--- a/docs/report-v3/out/credproof-report.docx
+++ b/docs/report-v3/out/credproof-report.docx
@@ -18646,16 +18646,16 @@
           <w:color w:val="000000"/>
           <w:sz w:val="24"/>
         </w:rPr>
-        <w:t>开发工具使用说明。</w:t>
-      </w:r>
-      <w:r>
-        <w:rPr>
-          <w:rFonts w:ascii="宋体" w:hAnsi="宋体" w:eastAsia="宋体" w:cs="宋体"/>
-          <w:b w:val="0"/>
-          <w:color w:val="000000"/>
-          <w:sz w:val="24"/>
-        </w:rPr>
-        <w:t xml:space="preserve"> 研发过程中使用了AI编码助手辅助编写部分代码与文档，全部内容经参赛团队审阅、测试并对其负责；报告中标注为“AI候选”的代码来自本地模型的真实输出，未经修饰。</w:t>
+        <w:t>数据真实性。</w:t>
+      </w:r>
+      <w:r>
+        <w:rPr>
+          <w:rFonts w:ascii="宋体" w:hAnsi="宋体" w:eastAsia="宋体" w:cs="宋体"/>
+          <w:b w:val="0"/>
+          <w:color w:val="000000"/>
+          <w:sz w:val="24"/>
+        </w:rPr>
+        <w:t xml:space="preserve"> 报告中的全部实验数据来自真实运行记录，失败与不利结果均如实保留；标注为“AI候选”的代码来自本地模型的真实输出，未经修饰；所有凭据均为随机生成的合成值，所有服务均为隔离环境内的本地模拟服务，未对任何真实系统进行测试。</w:t>
       </w:r>
     </w:p>
     <w:p>
@@ -18673,41 +18673,6 @@
           <w:sz w:val="24"/>
         </w:rPr>
         <w:t xml:space="preserve">4. </w:t>
-      </w:r>
-      <w:r>
-        <w:rPr>
-          <w:rFonts w:ascii="宋体" w:hAnsi="宋体" w:eastAsia="宋体" w:cs="宋体"/>
-          <w:b/>
-          <w:color w:val="000000"/>
-          <w:sz w:val="24"/>
-        </w:rPr>
-        <w:t>数据真实性。</w:t>
-      </w:r>
-      <w:r>
-        <w:rPr>
-          <w:rFonts w:ascii="宋体" w:hAnsi="宋体" w:eastAsia="宋体" w:cs="宋体"/>
-          <w:b w:val="0"/>
-          <w:color w:val="000000"/>
-          <w:sz w:val="24"/>
-        </w:rPr>
-        <w:t xml:space="preserve"> 报告中的全部实验数据来自真实运行记录，失败与不利结果均如实保留；所有凭据均为随机生成的合成值，所有服务均为隔离环境内的本地模拟服务，未对任何真实系统进行测试。</w:t>
-      </w:r>
-    </w:p>
-    <w:p>
-      <w:pPr>
-        <w:widowControl/>
-        <w:spacing w:line="360" w:lineRule="auto" w:before="0" w:after="60"/>
-        <w:ind w:left="480" w:hanging="360"/>
-        <w:jc w:val="left"/>
-      </w:pPr>
-      <w:r>
-        <w:rPr>
-          <w:rFonts w:ascii="宋体" w:hAnsi="宋体" w:eastAsia="宋体" w:cs="宋体"/>
-          <w:b w:val="0"/>
-          <w:color w:val="000000"/>
-          <w:sz w:val="24"/>
-        </w:rPr>
-        <w:t xml:space="preserve">5. </w:t>
       </w:r>
       <w:r>
         <w:rPr>

</xml_diff>